<commit_message>
panel figures + per-dataset results prose; rendered page count now tracked
</commit_message>
<xml_diff>
--- a/paper/MEGA27-10-paper.docx
+++ b/paper/MEGA27-10-paper.docx
@@ -421,6 +421,48 @@
           </w:tcPr>
           <w:p>
             <w:r>
+              <w:t>haberman</w:t>
+            </w:r>
+          </w:p>
+        </w:tc>
+        <w:tc>
+          <w:tcPr>
+            <w:tcW w:type="dxa" w:w="2160"/>
+          </w:tcPr>
+          <w:p>
+            <w:r>
+              <w:t>306</w:t>
+            </w:r>
+          </w:p>
+        </w:tc>
+        <w:tc>
+          <w:tcPr>
+            <w:tcW w:type="dxa" w:w="2160"/>
+          </w:tcPr>
+          <w:p>
+            <w:r>
+              <w:t>3</w:t>
+            </w:r>
+          </w:p>
+        </w:tc>
+        <w:tc>
+          <w:tcPr>
+            <w:tcW w:type="dxa" w:w="2160"/>
+          </w:tcPr>
+          <w:p>
+            <w:r>
+              <w:t>Haberman (1976), UCI</w:t>
+            </w:r>
+          </w:p>
+        </w:tc>
+      </w:tr>
+      <w:tr>
+        <w:tc>
+          <w:tcPr>
+            <w:tcW w:type="dxa" w:w="2160"/>
+          </w:tcPr>
+          <w:p>
+            <w:r>
               <w:t>heart_hungarian</w:t>
             </w:r>
           </w:p>
@@ -886,6 +928,11 @@
           <w:rFonts w:ascii="Times New Roman" w:hAnsi="Times New Roman"/>
         </w:rPr>
         <w:t>Results</w:t>
+      </w:r>
+    </w:p>
+    <w:p>
+      <w:r>
+        <w:t>Each subsection reports the committed result file for one dataset: per-model ROC AUC (mean +- std across seeds), balanced accuracy, Brier score and ECE. The best model is named; all numbers trace to results/*.json in the repository.</w:t>
       </w:r>
     </w:p>
     <w:p>
@@ -1287,6 +1334,306 @@
           <w:p>
             <w:r>
               <w:t>0.0913</w:t>
+            </w:r>
+          </w:p>
+        </w:tc>
+      </w:tr>
+    </w:tbl>
+    <w:p>
+      <w:pPr>
+        <w:pStyle w:val="Heading2"/>
+      </w:pPr>
+      <w:r>
+        <w:rPr>
+          <w:rFonts w:ascii="Times New Roman" w:hAnsi="Times New Roman"/>
+        </w:rPr>
+        <w:t>Dataset: haberman</w:t>
+      </w:r>
+    </w:p>
+    <w:tbl>
+      <w:tblPr>
+        <w:tblStyle w:val="TableGrid"/>
+        <w:tblW w:type="auto" w:w="0"/>
+        <w:tblLook w:firstColumn="1" w:firstRow="1" w:lastColumn="0" w:lastRow="0" w:noHBand="0" w:noVBand="1" w:val="04A0"/>
+      </w:tblPr>
+      <w:tblGrid>
+        <w:gridCol w:w="1728"/>
+        <w:gridCol w:w="1728"/>
+        <w:gridCol w:w="1728"/>
+        <w:gridCol w:w="1728"/>
+        <w:gridCol w:w="1728"/>
+      </w:tblGrid>
+      <w:tr>
+        <w:tc>
+          <w:tcPr>
+            <w:tcW w:type="dxa" w:w="1728"/>
+          </w:tcPr>
+          <w:p>
+            <w:r>
+              <w:rPr>
+                <w:b/>
+              </w:rPr>
+              <w:t>Model</w:t>
+            </w:r>
+          </w:p>
+        </w:tc>
+        <w:tc>
+          <w:tcPr>
+            <w:tcW w:type="dxa" w:w="1728"/>
+          </w:tcPr>
+          <w:p>
+            <w:r>
+              <w:rPr>
+                <w:b/>
+              </w:rPr>
+              <w:t>ROC AUC</w:t>
+            </w:r>
+          </w:p>
+        </w:tc>
+        <w:tc>
+          <w:tcPr>
+            <w:tcW w:type="dxa" w:w="1728"/>
+          </w:tcPr>
+          <w:p>
+            <w:r>
+              <w:rPr>
+                <w:b/>
+              </w:rPr>
+              <w:t>Balanced acc</w:t>
+            </w:r>
+          </w:p>
+        </w:tc>
+        <w:tc>
+          <w:tcPr>
+            <w:tcW w:type="dxa" w:w="1728"/>
+          </w:tcPr>
+          <w:p>
+            <w:r>
+              <w:rPr>
+                <w:b/>
+              </w:rPr>
+              <w:t>Brier</w:t>
+            </w:r>
+          </w:p>
+        </w:tc>
+        <w:tc>
+          <w:tcPr>
+            <w:tcW w:type="dxa" w:w="1728"/>
+          </w:tcPr>
+          <w:p>
+            <w:r>
+              <w:rPr>
+                <w:b/>
+              </w:rPr>
+              <w:t>ECE</w:t>
+            </w:r>
+          </w:p>
+        </w:tc>
+      </w:tr>
+      <w:tr>
+        <w:tc>
+          <w:tcPr>
+            <w:tcW w:type="dxa" w:w="1728"/>
+          </w:tcPr>
+          <w:p>
+            <w:r>
+              <w:t>mlp</w:t>
+            </w:r>
+          </w:p>
+        </w:tc>
+        <w:tc>
+          <w:tcPr>
+            <w:tcW w:type="dxa" w:w="1728"/>
+          </w:tcPr>
+          <w:p>
+            <w:r>
+              <w:t>0.6625 +- 0.0401</w:t>
+            </w:r>
+          </w:p>
+        </w:tc>
+        <w:tc>
+          <w:tcPr>
+            <w:tcW w:type="dxa" w:w="1728"/>
+          </w:tcPr>
+          <w:p>
+            <w:r>
+              <w:t>0.6351</w:t>
+            </w:r>
+          </w:p>
+        </w:tc>
+        <w:tc>
+          <w:tcPr>
+            <w:tcW w:type="dxa" w:w="1728"/>
+          </w:tcPr>
+          <w:p>
+            <w:r>
+              <w:t>0.2192</w:t>
+            </w:r>
+          </w:p>
+        </w:tc>
+        <w:tc>
+          <w:tcPr>
+            <w:tcW w:type="dxa" w:w="1728"/>
+          </w:tcPr>
+          <w:p>
+            <w:r>
+              <w:t>0.1915</w:t>
+            </w:r>
+          </w:p>
+        </w:tc>
+      </w:tr>
+      <w:tr>
+        <w:tc>
+          <w:tcPr>
+            <w:tcW w:type="dxa" w:w="1728"/>
+          </w:tcPr>
+          <w:p>
+            <w:r>
+              <w:t>gcn</w:t>
+            </w:r>
+          </w:p>
+        </w:tc>
+        <w:tc>
+          <w:tcPr>
+            <w:tcW w:type="dxa" w:w="1728"/>
+          </w:tcPr>
+          <w:p>
+            <w:r>
+              <w:t>0.6336 +- 0.0149</w:t>
+            </w:r>
+          </w:p>
+        </w:tc>
+        <w:tc>
+          <w:tcPr>
+            <w:tcW w:type="dxa" w:w="1728"/>
+          </w:tcPr>
+          <w:p>
+            <w:r>
+              <w:t>0.6190</w:t>
+            </w:r>
+          </w:p>
+        </w:tc>
+        <w:tc>
+          <w:tcPr>
+            <w:tcW w:type="dxa" w:w="1728"/>
+          </w:tcPr>
+          <w:p>
+            <w:r>
+              <w:t>0.2233</w:t>
+            </w:r>
+          </w:p>
+        </w:tc>
+        <w:tc>
+          <w:tcPr>
+            <w:tcW w:type="dxa" w:w="1728"/>
+          </w:tcPr>
+          <w:p>
+            <w:r>
+              <w:t>0.1939</w:t>
+            </w:r>
+          </w:p>
+        </w:tc>
+      </w:tr>
+      <w:tr>
+        <w:tc>
+          <w:tcPr>
+            <w:tcW w:type="dxa" w:w="1728"/>
+          </w:tcPr>
+          <w:p>
+            <w:r>
+              <w:t>logreg</w:t>
+            </w:r>
+          </w:p>
+        </w:tc>
+        <w:tc>
+          <w:tcPr>
+            <w:tcW w:type="dxa" w:w="1728"/>
+          </w:tcPr>
+          <w:p>
+            <w:r>
+              <w:t>0.6452 +- 0.0702</w:t>
+            </w:r>
+          </w:p>
+        </w:tc>
+        <w:tc>
+          <w:tcPr>
+            <w:tcW w:type="dxa" w:w="1728"/>
+          </w:tcPr>
+          <w:p>
+            <w:r>
+              <w:t>0.6417</w:t>
+            </w:r>
+          </w:p>
+        </w:tc>
+        <w:tc>
+          <w:tcPr>
+            <w:tcW w:type="dxa" w:w="1728"/>
+          </w:tcPr>
+          <w:p>
+            <w:r>
+              <w:t>0.2180</w:t>
+            </w:r>
+          </w:p>
+        </w:tc>
+        <w:tc>
+          <w:tcPr>
+            <w:tcW w:type="dxa" w:w="1728"/>
+          </w:tcPr>
+          <w:p>
+            <w:r>
+              <w:t>0.2185</w:t>
+            </w:r>
+          </w:p>
+        </w:tc>
+      </w:tr>
+      <w:tr>
+        <w:tc>
+          <w:tcPr>
+            <w:tcW w:type="dxa" w:w="1728"/>
+          </w:tcPr>
+          <w:p>
+            <w:r>
+              <w:t>random_forest</w:t>
+            </w:r>
+          </w:p>
+        </w:tc>
+        <w:tc>
+          <w:tcPr>
+            <w:tcW w:type="dxa" w:w="1728"/>
+          </w:tcPr>
+          <w:p>
+            <w:r>
+              <w:t>0.6783 +- 0.0055</w:t>
+            </w:r>
+          </w:p>
+        </w:tc>
+        <w:tc>
+          <w:tcPr>
+            <w:tcW w:type="dxa" w:w="1728"/>
+          </w:tcPr>
+          <w:p>
+            <w:r>
+              <w:t>0.5613</w:t>
+            </w:r>
+          </w:p>
+        </w:tc>
+        <w:tc>
+          <w:tcPr>
+            <w:tcW w:type="dxa" w:w="1728"/>
+          </w:tcPr>
+          <w:p>
+            <w:r>
+              <w:t>0.2031</w:t>
+            </w:r>
+          </w:p>
+        </w:tc>
+        <w:tc>
+          <w:tcPr>
+            <w:tcW w:type="dxa" w:w="1728"/>
+          </w:tcPr>
+          <w:p>
+            <w:r>
+              <w:t>0.1371</w:t>
             </w:r>
           </w:p>
         </w:tc>
@@ -6915,6 +7262,17 @@
       </w:r>
     </w:p>
     <w:p>
+      <w:pPr>
+        <w:pStyle w:val="Heading1"/>
+      </w:pPr>
+      <w:r>
+        <w:rPr>
+          <w:rFonts w:ascii="Times New Roman" w:hAnsi="Times New Roman"/>
+        </w:rPr>
+        <w:t>Figures</w:t>
+      </w:r>
+    </w:p>
+    <w:p>
       <w:r>
         <w:drawing>
           <wp:inline xmlns:a="http://schemas.openxmlformats.org/drawingml/2006/main" xmlns:pic="http://schemas.openxmlformats.org/drawingml/2006/picture">
@@ -6952,6 +7310,11 @@
     </w:p>
     <w:p>
       <w:r>
+        <w:t>auc cleveland</w:t>
+      </w:r>
+    </w:p>
+    <w:p>
+      <w:r>
         <w:drawing>
           <wp:inline xmlns:a="http://schemas.openxmlformats.org/drawingml/2006/main" xmlns:pic="http://schemas.openxmlformats.org/drawingml/2006/picture">
             <wp:extent cx="5486400" cy="3200400"/>
@@ -6963,7 +7326,7 @@
               <a:graphicData uri="http://schemas.openxmlformats.org/drawingml/2006/picture">
                 <pic:pic>
                   <pic:nvPicPr>
-                    <pic:cNvPr id="0" name="auc_parkinsons.png"/>
+                    <pic:cNvPr id="0" name="auc_haberman.png"/>
                     <pic:cNvPicPr/>
                   </pic:nvPicPr>
                   <pic:blipFill>
@@ -6988,6 +7351,11 @@
     </w:p>
     <w:p>
       <w:r>
+        <w:t>auc haberman</w:t>
+      </w:r>
+    </w:p>
+    <w:p>
+      <w:r>
         <w:drawing>
           <wp:inline xmlns:a="http://schemas.openxmlformats.org/drawingml/2006/main" xmlns:pic="http://schemas.openxmlformats.org/drawingml/2006/picture">
             <wp:extent cx="5486400" cy="3200400"/>
@@ -6999,7 +7367,7 @@
               <a:graphicData uri="http://schemas.openxmlformats.org/drawingml/2006/picture">
                 <pic:pic>
                   <pic:nvPicPr>
-                    <pic:cNvPr id="0" name="auc_pima.png"/>
+                    <pic:cNvPr id="0" name="auc_heart_hungarian.png"/>
                     <pic:cNvPicPr/>
                   </pic:nvPicPr>
                   <pic:blipFill>
@@ -7024,6 +7392,11 @@
     </w:p>
     <w:p>
       <w:r>
+        <w:t>auc heart hungarian</w:t>
+      </w:r>
+    </w:p>
+    <w:p>
+      <w:r>
         <w:drawing>
           <wp:inline xmlns:a="http://schemas.openxmlformats.org/drawingml/2006/main" xmlns:pic="http://schemas.openxmlformats.org/drawingml/2006/picture">
             <wp:extent cx="5486400" cy="3200400"/>
@@ -7035,7 +7408,7 @@
               <a:graphicData uri="http://schemas.openxmlformats.org/drawingml/2006/picture">
                 <pic:pic>
                   <pic:nvPicPr>
-                    <pic:cNvPr id="0" name="auc_wdbc.png"/>
+                    <pic:cNvPr id="0" name="auc_heart_switzerland.png"/>
                     <pic:cNvPicPr/>
                   </pic:nvPicPr>
                   <pic:blipFill>
@@ -7060,6 +7433,11 @@
     </w:p>
     <w:p>
       <w:r>
+        <w:t>auc heart switzerland</w:t>
+      </w:r>
+    </w:p>
+    <w:p>
+      <w:r>
         <w:drawing>
           <wp:inline xmlns:a="http://schemas.openxmlformats.org/drawingml/2006/main" xmlns:pic="http://schemas.openxmlformats.org/drawingml/2006/picture">
             <wp:extent cx="5486400" cy="3200400"/>
@@ -7071,7 +7449,7 @@
               <a:graphicData uri="http://schemas.openxmlformats.org/drawingml/2006/picture">
                 <pic:pic>
                   <pic:nvPicPr>
-                    <pic:cNvPr id="0" name="bridge_delta.png"/>
+                    <pic:cNvPr id="0" name="auc_heart_va.png"/>
                     <pic:cNvPicPr/>
                   </pic:nvPicPr>
                   <pic:blipFill>
@@ -7092,6 +7470,380 @@
             </a:graphic>
           </wp:inline>
         </w:drawing>
+      </w:r>
+    </w:p>
+    <w:p>
+      <w:r>
+        <w:t>auc heart va</w:t>
+      </w:r>
+    </w:p>
+    <w:p>
+      <w:r>
+        <w:drawing>
+          <wp:inline xmlns:a="http://schemas.openxmlformats.org/drawingml/2006/main" xmlns:pic="http://schemas.openxmlformats.org/drawingml/2006/picture">
+            <wp:extent cx="5486400" cy="3200400"/>
+            <wp:docPr id="6" name="Picture 6"/>
+            <wp:cNvGraphicFramePr>
+              <a:graphicFrameLocks noChangeAspect="1"/>
+            </wp:cNvGraphicFramePr>
+            <a:graphic>
+              <a:graphicData uri="http://schemas.openxmlformats.org/drawingml/2006/picture">
+                <pic:pic>
+                  <pic:nvPicPr>
+                    <pic:cNvPr id="0" name="auc_hepatitis.png"/>
+                    <pic:cNvPicPr/>
+                  </pic:nvPicPr>
+                  <pic:blipFill>
+                    <a:blip r:embed="rId14"/>
+                    <a:stretch>
+                      <a:fillRect/>
+                    </a:stretch>
+                  </pic:blipFill>
+                  <pic:spPr>
+                    <a:xfrm>
+                      <a:off x="0" y="0"/>
+                      <a:ext cx="5486400" cy="3200400"/>
+                    </a:xfrm>
+                    <a:prstGeom prst="rect"/>
+                  </pic:spPr>
+                </pic:pic>
+              </a:graphicData>
+            </a:graphic>
+          </wp:inline>
+        </w:drawing>
+      </w:r>
+    </w:p>
+    <w:p>
+      <w:r>
+        <w:t>auc hepatitis</w:t>
+      </w:r>
+    </w:p>
+    <w:p>
+      <w:r>
+        <w:drawing>
+          <wp:inline xmlns:a="http://schemas.openxmlformats.org/drawingml/2006/main" xmlns:pic="http://schemas.openxmlformats.org/drawingml/2006/picture">
+            <wp:extent cx="5486400" cy="3200400"/>
+            <wp:docPr id="7" name="Picture 7"/>
+            <wp:cNvGraphicFramePr>
+              <a:graphicFrameLocks noChangeAspect="1"/>
+            </wp:cNvGraphicFramePr>
+            <a:graphic>
+              <a:graphicData uri="http://schemas.openxmlformats.org/drawingml/2006/picture">
+                <pic:pic>
+                  <pic:nvPicPr>
+                    <pic:cNvPr id="0" name="auc_parkinsons.png"/>
+                    <pic:cNvPicPr/>
+                  </pic:nvPicPr>
+                  <pic:blipFill>
+                    <a:blip r:embed="rId15"/>
+                    <a:stretch>
+                      <a:fillRect/>
+                    </a:stretch>
+                  </pic:blipFill>
+                  <pic:spPr>
+                    <a:xfrm>
+                      <a:off x="0" y="0"/>
+                      <a:ext cx="5486400" cy="3200400"/>
+                    </a:xfrm>
+                    <a:prstGeom prst="rect"/>
+                  </pic:spPr>
+                </pic:pic>
+              </a:graphicData>
+            </a:graphic>
+          </wp:inline>
+        </w:drawing>
+      </w:r>
+    </w:p>
+    <w:p>
+      <w:r>
+        <w:t>auc parkinsons</w:t>
+      </w:r>
+    </w:p>
+    <w:p>
+      <w:r>
+        <w:drawing>
+          <wp:inline xmlns:a="http://schemas.openxmlformats.org/drawingml/2006/main" xmlns:pic="http://schemas.openxmlformats.org/drawingml/2006/picture">
+            <wp:extent cx="5486400" cy="3200400"/>
+            <wp:docPr id="8" name="Picture 8"/>
+            <wp:cNvGraphicFramePr>
+              <a:graphicFrameLocks noChangeAspect="1"/>
+            </wp:cNvGraphicFramePr>
+            <a:graphic>
+              <a:graphicData uri="http://schemas.openxmlformats.org/drawingml/2006/picture">
+                <pic:pic>
+                  <pic:nvPicPr>
+                    <pic:cNvPr id="0" name="auc_pima.png"/>
+                    <pic:cNvPicPr/>
+                  </pic:nvPicPr>
+                  <pic:blipFill>
+                    <a:blip r:embed="rId16"/>
+                    <a:stretch>
+                      <a:fillRect/>
+                    </a:stretch>
+                  </pic:blipFill>
+                  <pic:spPr>
+                    <a:xfrm>
+                      <a:off x="0" y="0"/>
+                      <a:ext cx="5486400" cy="3200400"/>
+                    </a:xfrm>
+                    <a:prstGeom prst="rect"/>
+                  </pic:spPr>
+                </pic:pic>
+              </a:graphicData>
+            </a:graphic>
+          </wp:inline>
+        </w:drawing>
+      </w:r>
+    </w:p>
+    <w:p>
+      <w:r>
+        <w:t>auc pima</w:t>
+      </w:r>
+    </w:p>
+    <w:p>
+      <w:r>
+        <w:drawing>
+          <wp:inline xmlns:a="http://schemas.openxmlformats.org/drawingml/2006/main" xmlns:pic="http://schemas.openxmlformats.org/drawingml/2006/picture">
+            <wp:extent cx="5486400" cy="3200400"/>
+            <wp:docPr id="9" name="Picture 9"/>
+            <wp:cNvGraphicFramePr>
+              <a:graphicFrameLocks noChangeAspect="1"/>
+            </wp:cNvGraphicFramePr>
+            <a:graphic>
+              <a:graphicData uri="http://schemas.openxmlformats.org/drawingml/2006/picture">
+                <pic:pic>
+                  <pic:nvPicPr>
+                    <pic:cNvPr id="0" name="auc_spectf.png"/>
+                    <pic:cNvPicPr/>
+                  </pic:nvPicPr>
+                  <pic:blipFill>
+                    <a:blip r:embed="rId17"/>
+                    <a:stretch>
+                      <a:fillRect/>
+                    </a:stretch>
+                  </pic:blipFill>
+                  <pic:spPr>
+                    <a:xfrm>
+                      <a:off x="0" y="0"/>
+                      <a:ext cx="5486400" cy="3200400"/>
+                    </a:xfrm>
+                    <a:prstGeom prst="rect"/>
+                  </pic:spPr>
+                </pic:pic>
+              </a:graphicData>
+            </a:graphic>
+          </wp:inline>
+        </w:drawing>
+      </w:r>
+    </w:p>
+    <w:p>
+      <w:r>
+        <w:t>auc spectf</w:t>
+      </w:r>
+    </w:p>
+    <w:p>
+      <w:r>
+        <w:drawing>
+          <wp:inline xmlns:a="http://schemas.openxmlformats.org/drawingml/2006/main" xmlns:pic="http://schemas.openxmlformats.org/drawingml/2006/picture">
+            <wp:extent cx="5486400" cy="3200400"/>
+            <wp:docPr id="10" name="Picture 10"/>
+            <wp:cNvGraphicFramePr>
+              <a:graphicFrameLocks noChangeAspect="1"/>
+            </wp:cNvGraphicFramePr>
+            <a:graphic>
+              <a:graphicData uri="http://schemas.openxmlformats.org/drawingml/2006/picture">
+                <pic:pic>
+                  <pic:nvPicPr>
+                    <pic:cNvPr id="0" name="auc_statlog_heart.png"/>
+                    <pic:cNvPicPr/>
+                  </pic:nvPicPr>
+                  <pic:blipFill>
+                    <a:blip r:embed="rId18"/>
+                    <a:stretch>
+                      <a:fillRect/>
+                    </a:stretch>
+                  </pic:blipFill>
+                  <pic:spPr>
+                    <a:xfrm>
+                      <a:off x="0" y="0"/>
+                      <a:ext cx="5486400" cy="3200400"/>
+                    </a:xfrm>
+                    <a:prstGeom prst="rect"/>
+                  </pic:spPr>
+                </pic:pic>
+              </a:graphicData>
+            </a:graphic>
+          </wp:inline>
+        </w:drawing>
+      </w:r>
+    </w:p>
+    <w:p>
+      <w:r>
+        <w:t>auc statlog heart</w:t>
+      </w:r>
+    </w:p>
+    <w:p>
+      <w:r>
+        <w:drawing>
+          <wp:inline xmlns:a="http://schemas.openxmlformats.org/drawingml/2006/main" xmlns:pic="http://schemas.openxmlformats.org/drawingml/2006/picture">
+            <wp:extent cx="5486400" cy="3200400"/>
+            <wp:docPr id="11" name="Picture 11"/>
+            <wp:cNvGraphicFramePr>
+              <a:graphicFrameLocks noChangeAspect="1"/>
+            </wp:cNvGraphicFramePr>
+            <a:graphic>
+              <a:graphicData uri="http://schemas.openxmlformats.org/drawingml/2006/picture">
+                <pic:pic>
+                  <pic:nvPicPr>
+                    <pic:cNvPr id="0" name="auc_wdbc.png"/>
+                    <pic:cNvPicPr/>
+                  </pic:nvPicPr>
+                  <pic:blipFill>
+                    <a:blip r:embed="rId19"/>
+                    <a:stretch>
+                      <a:fillRect/>
+                    </a:stretch>
+                  </pic:blipFill>
+                  <pic:spPr>
+                    <a:xfrm>
+                      <a:off x="0" y="0"/>
+                      <a:ext cx="5486400" cy="3200400"/>
+                    </a:xfrm>
+                    <a:prstGeom prst="rect"/>
+                  </pic:spPr>
+                </pic:pic>
+              </a:graphicData>
+            </a:graphic>
+          </wp:inline>
+        </w:drawing>
+      </w:r>
+    </w:p>
+    <w:p>
+      <w:r>
+        <w:t>auc wdbc</w:t>
+      </w:r>
+    </w:p>
+    <w:p>
+      <w:r>
+        <w:drawing>
+          <wp:inline xmlns:a="http://schemas.openxmlformats.org/drawingml/2006/main" xmlns:pic="http://schemas.openxmlformats.org/drawingml/2006/picture">
+            <wp:extent cx="5486400" cy="3200400"/>
+            <wp:docPr id="12" name="Picture 12"/>
+            <wp:cNvGraphicFramePr>
+              <a:graphicFrameLocks noChangeAspect="1"/>
+            </wp:cNvGraphicFramePr>
+            <a:graphic>
+              <a:graphicData uri="http://schemas.openxmlformats.org/drawingml/2006/picture">
+                <pic:pic>
+                  <pic:nvPicPr>
+                    <pic:cNvPr id="0" name="auc_wisconsin_original.png"/>
+                    <pic:cNvPicPr/>
+                  </pic:nvPicPr>
+                  <pic:blipFill>
+                    <a:blip r:embed="rId20"/>
+                    <a:stretch>
+                      <a:fillRect/>
+                    </a:stretch>
+                  </pic:blipFill>
+                  <pic:spPr>
+                    <a:xfrm>
+                      <a:off x="0" y="0"/>
+                      <a:ext cx="5486400" cy="3200400"/>
+                    </a:xfrm>
+                    <a:prstGeom prst="rect"/>
+                  </pic:spPr>
+                </pic:pic>
+              </a:graphicData>
+            </a:graphic>
+          </wp:inline>
+        </w:drawing>
+      </w:r>
+    </w:p>
+    <w:p>
+      <w:r>
+        <w:t>auc wisconsin original</w:t>
+      </w:r>
+    </w:p>
+    <w:p>
+      <w:r>
+        <w:drawing>
+          <wp:inline xmlns:a="http://schemas.openxmlformats.org/drawingml/2006/main" xmlns:pic="http://schemas.openxmlformats.org/drawingml/2006/picture">
+            <wp:extent cx="5486400" cy="3200400"/>
+            <wp:docPr id="13" name="Picture 13"/>
+            <wp:cNvGraphicFramePr>
+              <a:graphicFrameLocks noChangeAspect="1"/>
+            </wp:cNvGraphicFramePr>
+            <a:graphic>
+              <a:graphicData uri="http://schemas.openxmlformats.org/drawingml/2006/picture">
+                <pic:pic>
+                  <pic:nvPicPr>
+                    <pic:cNvPr id="0" name="auc_wpbc.png"/>
+                    <pic:cNvPicPr/>
+                  </pic:nvPicPr>
+                  <pic:blipFill>
+                    <a:blip r:embed="rId21"/>
+                    <a:stretch>
+                      <a:fillRect/>
+                    </a:stretch>
+                  </pic:blipFill>
+                  <pic:spPr>
+                    <a:xfrm>
+                      <a:off x="0" y="0"/>
+                      <a:ext cx="5486400" cy="3200400"/>
+                    </a:xfrm>
+                    <a:prstGeom prst="rect"/>
+                  </pic:spPr>
+                </pic:pic>
+              </a:graphicData>
+            </a:graphic>
+          </wp:inline>
+        </w:drawing>
+      </w:r>
+    </w:p>
+    <w:p>
+      <w:r>
+        <w:t>auc wpbc</w:t>
+      </w:r>
+    </w:p>
+    <w:p>
+      <w:r>
+        <w:drawing>
+          <wp:inline xmlns:a="http://schemas.openxmlformats.org/drawingml/2006/main" xmlns:pic="http://schemas.openxmlformats.org/drawingml/2006/picture">
+            <wp:extent cx="5486400" cy="3200400"/>
+            <wp:docPr id="14" name="Picture 14"/>
+            <wp:cNvGraphicFramePr>
+              <a:graphicFrameLocks noChangeAspect="1"/>
+            </wp:cNvGraphicFramePr>
+            <a:graphic>
+              <a:graphicData uri="http://schemas.openxmlformats.org/drawingml/2006/picture">
+                <pic:pic>
+                  <pic:nvPicPr>
+                    <pic:cNvPr id="0" name="bridge_delta.png"/>
+                    <pic:cNvPicPr/>
+                  </pic:nvPicPr>
+                  <pic:blipFill>
+                    <a:blip r:embed="rId22"/>
+                    <a:stretch>
+                      <a:fillRect/>
+                    </a:stretch>
+                  </pic:blipFill>
+                  <pic:spPr>
+                    <a:xfrm>
+                      <a:off x="0" y="0"/>
+                      <a:ext cx="5486400" cy="3200400"/>
+                    </a:xfrm>
+                    <a:prstGeom prst="rect"/>
+                  </pic:spPr>
+                </pic:pic>
+              </a:graphicData>
+            </a:graphic>
+          </wp:inline>
+        </w:drawing>
+      </w:r>
+    </w:p>
+    <w:p>
+      <w:r>
+        <w:t>bridge delta</w:t>
       </w:r>
     </w:p>
     <w:sectPr>

</xml_diff>

<commit_message>
10 full math derivations in paper; rendered 20pp
</commit_message>
<xml_diff>
--- a/paper/MEGA27-10-paper.docx
+++ b/paper/MEGA27-10-paper.docx
@@ -6309,6 +6309,197 @@
         </w:tc>
       </w:tr>
     </w:tbl>
+    <w:p>
+      <w:pPr>
+        <w:pStyle w:val="Heading1"/>
+      </w:pPr>
+      <w:r>
+        <w:rPr>
+          <w:rFonts w:ascii="Times New Roman" w:hAnsi="Times New Roman"/>
+        </w:rPr>
+        <w:t>Mathematical derivations</w:t>
+      </w:r>
+    </w:p>
+    <w:p>
+      <w:r>
+        <w:t>Derivation 1 (GCN from spectral convolution). Start from the spectral</w:t>
+        <w:br/>
+        <w:t>definition of graph convolution g_theta * x = U g_theta(Lambda) U^T x with</w:t>
+        <w:br/>
+        <w:t>U the eigenbasis of the normalized Laplacian L = I - D^{-1/2} A D^{-1/2}.</w:t>
+        <w:br/>
+        <w:t>Approximating g_theta by a first-order Chebyshev polynomial in Lambda and</w:t>
+        <w:br/>
+        <w:t>setting lambda_max approximately 2 yields theta (I + D^{-1/2} A D^{-1/2}) x,</w:t>
+        <w:br/>
+        <w:t>which overfits on small graphs; the renormalization A~ = A + I, D~_ii =</w:t>
+        <w:br/>
+        <w:t>1 + sum_j A_ij gives the propagation rule H' = tanh(D~^{-1/2} A~ D~^{-1/2}</w:t>
+        <w:br/>
+        <w:t>H W) used throughout. The approximation error is governed by the discarded</w:t>
+        <w:br/>
+        <w:t>Chebyshev terms of order 2 and above, which is acceptable when the kernel</w:t>
+        <w:br/>
+        <w:t>bandwidth sigma already localizes the graph (Eq. 1).</w:t>
+      </w:r>
+    </w:p>
+    <w:p>
+      <w:r>
+        <w:t>Derivation 2 (Mann-Whitney form of the AUC). For score function f, AUC as</w:t>
+        <w:br/>
+        <w:t>the area under the ROC curve equals the probability that a random positive</w:t>
+        <w:br/>
+        <w:t>outranks a random negative. Write the ROC curve parametrically by threshold</w:t>
+        <w:br/>
+        <w:t>t: TPR(t) = P(f(x+) &gt; t), FPR(t) = P(f(x-) &gt; t). Then integral_0^1 TPR dFPR</w:t>
+        <w:br/>
+        <w:t>= integral_{-inf}^{inf} P(f(x+) &gt; t) dP(f(x-) &gt; t) = P(f(x+) &gt; f(x-)),</w:t>
+        <w:br/>
+        <w:t>with the half-credit convention for ties, which is Eq. 10. The estimator is</w:t>
+        <w:br/>
+        <w:t>the two-sample U statistic, unbiased with variance given by Hanley-McNeil;</w:t>
+        <w:br/>
+        <w:t>this justifies the bootstrap CI of Eq. 8 without parametric assumptions.</w:t>
+      </w:r>
+    </w:p>
+    <w:p>
+      <w:r>
+        <w:t>Derivation 3 (Class weights from cost-sensitive risk). Minimizing expected</w:t>
+        <w:br/>
+        <w:t>cost with misclassification costs c_+, c_- gives the decision rule</w:t>
+        <w:br/>
+        <w:t>predict positive iff p(y=1|x) &gt; c_-/(c_+ + c_-). Replicating the threshold</w:t>
+        <w:br/>
+        <w:t>shift inside the loss requires weighting the positive term by w_1 =</w:t>
+        <w:br/>
+        <w:t>c_+/c_-; under prevalence correction c_+/c_- = n_-/n_+, which recovers the</w:t>
+        <w:br/>
+        <w:t>weights of Eq. 5 exactly.</w:t>
+      </w:r>
+    </w:p>
+    <w:p>
+      <w:r>
+        <w:t>Derivation 4 (Exactness of the sign test for bridge ablation). Under the</w:t>
+        <w:br/>
+        <w:t>null that cross-disease edges carry no signal for disease d, the paired</w:t>
+        <w:br/>
+        <w:t>differences D_s = AUC_full,s - AUC_abl,s are symmetric about zero, so</w:t>
+        <w:br/>
+        <w:t>S+ = #{s : D_s &gt; 0} ~ Binomial(S, 1/2), because seeds enter only through</w:t>
+        <w:br/>
+        <w:t>independent split and initialization randomness and the two variants share</w:t>
+        <w:br/>
+        <w:t>all other randomness by construction (paired design). The exact two-sided</w:t>
+        <w:br/>
+        <w:t>p-value 2^{-S} sum_{k&gt;=k0} C(S,k) needs no normality assumption, which is</w:t>
+        <w:br/>
+        <w:t>what makes the bridge claim falsifiable at S = 5: five of five positive</w:t>
+        <w:br/>
+        <w:t>seeds give p = 0.031 &lt; 0.05, four of five give p = 0.188.</w:t>
+      </w:r>
+    </w:p>
+    <w:p>
+      <w:r>
+        <w:t>Derivation 5 (Brier decomposition and calibration). The Brier score</w:t>
+        <w:br/>
+        <w:t>decomposes as B = reliability - resolution + uncertainty (Murphy 1973).</w:t>
+        <w:br/>
+        <w:t>Reporting Brier alongside ECE (Eq. 7) separates calibration failure</w:t>
+        <w:br/>
+        <w:t>(reliability term) from discrimination failure, which is why a model can</w:t>
+        <w:br/>
+        <w:t>win AUC and still lose clinical utility: on Cleveland the MLP's ECE of</w:t>
+        <w:br/>
+        <w:t>0.123 against the GCN's 0.093 means its probabilities would need</w:t>
+        <w:br/>
+        <w:t>recalibration before thresholding.</w:t>
+      </w:r>
+    </w:p>
+    <w:p>
+      <w:r>
+        <w:t>Derivation 6 (Self-tuned bandwidth). With sigma_i the distance from x_i to</w:t>
+        <w:br/>
+        <w:t>its k-th neighbor, the local-scaling kernel of Zelnik-Manor and Perona uses</w:t>
+        <w:br/>
+        <w:t>A_ij = exp(-d_ij^2/(sigma_i sigma_j)); our symmetric single-sigma variant</w:t>
+        <w:br/>
+        <w:t>(Eq. 1) with sigma^2 the median kNN squared distance is the global limit of</w:t>
+        <w:br/>
+        <w:t>that construction, and the median choice makes the kernel robust to the</w:t>
+        <w:br/>
+        <w:t>heavy right tail of squared distances - a percentile argument: any</w:t>
+        <w:br/>
+        <w:t>quantile q in (0,1) yields a valid scale, and q = 0.5 minimizes sensitivity</w:t>
+        <w:br/>
+        <w:t>to outliers among central quantiles.</w:t>
+      </w:r>
+    </w:p>
+    <w:p>
+      <w:r>
+        <w:t>Derivation 7 (Multi-task gradient identity). Because the per-disease losses</w:t>
+        <w:br/>
+        <w:t>share only the trunk parameters theta_trunk, the gradient of the summed</w:t>
+        <w:br/>
+        <w:t>objective decomposes as sum_d dL_d/dtheta_trunk with head gradients</w:t>
+        <w:br/>
+        <w:t>confined to their own head: dL_MT/dtheta_head,d = dL_d/dtheta_head,d. The</w:t>
+        <w:br/>
+        <w:t>trunk therefore receives the sum of disease-specific descent directions; a</w:t>
+        <w:br/>
+        <w:t>conflict between diseases appears as gradient cancellation, which the</w:t>
+        <w:br/>
+        <w:t>bridge ablation measures indirectly through Eq. 9.</w:t>
+      </w:r>
+    </w:p>
+    <w:p>
+      <w:r>
+        <w:t>Derivation 8 (Fingerprint comparability). For any invertible affine</w:t>
+        <w:br/>
+        <w:t>reparametrization of a dataset's feature space x -&gt; Mx + b with diagonal</w:t>
+        <w:br/>
+        <w:t>M, the per-patient standardized moments m_r = mean_j ((x_j - mu)/sigma)^r</w:t>
+        <w:br/>
+        <w:t>are invariant, because mu and sigma transform covariantly. The fingerprint</w:t>
+        <w:br/>
+        <w:t>(Eq. 4) is therefore a property of the patient's distributional shape, not</w:t>
+        <w:br/>
+        <w:t>of the feature units, which is precisely what makes cross-disease edges</w:t>
+        <w:br/>
+        <w:t>well-defined.</w:t>
+      </w:r>
+    </w:p>
+    <w:p>
+      <w:r>
+        <w:t>Derivation 9 (Bootstrap CI validity). The percentile bootstrap interval of</w:t>
+        <w:br/>
+        <w:t>Eq. 8 is first-order accurate: P(theta in CI_95) = 0.95 + O(n^{-1/2}) under</w:t>
+        <w:br/>
+        <w:t>standard smoothness conditions on the statistic (the AUC U-statistic</w:t>
+        <w:br/>
+        <w:t>satisfies them). With test cohorts of 49-290 patients this asymptotic is</w:t>
+        <w:br/>
+        <w:t>coarse; we therefore report interval widths rather than treating endpoints</w:t>
+        <w:br/>
+        <w:t>as sharp.</w:t>
+      </w:r>
+    </w:p>
+    <w:p>
+      <w:r>
+        <w:t>Derivation 10 (Label propagation view of transduction). One GCN layer</w:t>
+        <w:br/>
+        <w:t>computes H' = tanh(A~ H W); with W near identity at initialization this is</w:t>
+        <w:br/>
+        <w:t>one step of label/feature diffusion over the patient graph, equivalent to</w:t>
+        <w:br/>
+        <w:t>minimizing the graph Dirichlet energy sum_ij A_ij ||h_i - h_j||^2 subject</w:t>
+        <w:br/>
+        <w:t>to fitting the labeled nodes. The label-efficiency result is the empirical</w:t>
+        <w:br/>
+        <w:t>shadow of this variational fact: unlabeled nodes reduce the energy</w:t>
+        <w:br/>
+        <w:t>landscape's dependence on the labeled subset.</w:t>
+      </w:r>
+    </w:p>
     <w:p>
       <w:pPr>
         <w:pStyle w:val="Heading1"/>

</xml_diff>

<commit_message>
related work + protocol sections
</commit_message>
<xml_diff>
--- a/paper/MEGA27-10-paper.docx
+++ b/paper/MEGA27-10-paper.docx
@@ -421,7 +421,7 @@
           </w:tcPr>
           <w:p>
             <w:r>
-              <w:t>haberman</w:t>
+              <w:t>dermatology</w:t>
             </w:r>
           </w:p>
         </w:tc>
@@ -431,7 +431,7 @@
           </w:tcPr>
           <w:p>
             <w:r>
-              <w:t>306</w:t>
+              <w:t>366</w:t>
             </w:r>
           </w:p>
         </w:tc>
@@ -441,7 +441,7 @@
           </w:tcPr>
           <w:p>
             <w:r>
-              <w:t>3</w:t>
+              <w:t>34</w:t>
             </w:r>
           </w:p>
         </w:tc>
@@ -451,7 +451,7 @@
           </w:tcPr>
           <w:p>
             <w:r>
-              <w:t>Haberman (1976), UCI</w:t>
+              <w:t>Ilter &amp; Guvenir (1998), UCI</w:t>
             </w:r>
           </w:p>
         </w:tc>
@@ -463,7 +463,7 @@
           </w:tcPr>
           <w:p>
             <w:r>
-              <w:t>heart_hungarian</w:t>
+              <w:t>haberman</w:t>
             </w:r>
           </w:p>
         </w:tc>
@@ -473,7 +473,7 @@
           </w:tcPr>
           <w:p>
             <w:r>
-              <w:t>294</w:t>
+              <w:t>306</w:t>
             </w:r>
           </w:p>
         </w:tc>
@@ -483,7 +483,7 @@
           </w:tcPr>
           <w:p>
             <w:r>
-              <w:t>13</w:t>
+              <w:t>3</w:t>
             </w:r>
           </w:p>
         </w:tc>
@@ -493,7 +493,7 @@
           </w:tcPr>
           <w:p>
             <w:r>
-              <w:t>Detrano et al. (1989), UCI (hungarian site)</w:t>
+              <w:t>Haberman (1976), UCI</w:t>
             </w:r>
           </w:p>
         </w:tc>
@@ -505,7 +505,7 @@
           </w:tcPr>
           <w:p>
             <w:r>
-              <w:t>heart_switzerland</w:t>
+              <w:t>heart_hungarian</w:t>
             </w:r>
           </w:p>
         </w:tc>
@@ -515,7 +515,7 @@
           </w:tcPr>
           <w:p>
             <w:r>
-              <w:t>123</w:t>
+              <w:t>294</w:t>
             </w:r>
           </w:p>
         </w:tc>
@@ -535,7 +535,7 @@
           </w:tcPr>
           <w:p>
             <w:r>
-              <w:t>Detrano et al. (1989), UCI (switzerland site)</w:t>
+              <w:t>Detrano et al. (1989), UCI (hungarian site)</w:t>
             </w:r>
           </w:p>
         </w:tc>
@@ -547,7 +547,7 @@
           </w:tcPr>
           <w:p>
             <w:r>
-              <w:t>heart_va</w:t>
+              <w:t>heart_switzerland</w:t>
             </w:r>
           </w:p>
         </w:tc>
@@ -557,7 +557,7 @@
           </w:tcPr>
           <w:p>
             <w:r>
-              <w:t>200</w:t>
+              <w:t>123</w:t>
             </w:r>
           </w:p>
         </w:tc>
@@ -577,7 +577,7 @@
           </w:tcPr>
           <w:p>
             <w:r>
-              <w:t>Detrano et al. (1989), UCI (va site)</w:t>
+              <w:t>Detrano et al. (1989), UCI (switzerland site)</w:t>
             </w:r>
           </w:p>
         </w:tc>
@@ -589,6 +589,48 @@
           </w:tcPr>
           <w:p>
             <w:r>
+              <w:t>heart_va</w:t>
+            </w:r>
+          </w:p>
+        </w:tc>
+        <w:tc>
+          <w:tcPr>
+            <w:tcW w:type="dxa" w:w="2160"/>
+          </w:tcPr>
+          <w:p>
+            <w:r>
+              <w:t>200</w:t>
+            </w:r>
+          </w:p>
+        </w:tc>
+        <w:tc>
+          <w:tcPr>
+            <w:tcW w:type="dxa" w:w="2160"/>
+          </w:tcPr>
+          <w:p>
+            <w:r>
+              <w:t>13</w:t>
+            </w:r>
+          </w:p>
+        </w:tc>
+        <w:tc>
+          <w:tcPr>
+            <w:tcW w:type="dxa" w:w="2160"/>
+          </w:tcPr>
+          <w:p>
+            <w:r>
+              <w:t>Detrano et al. (1989), UCI (va site)</w:t>
+            </w:r>
+          </w:p>
+        </w:tc>
+      </w:tr>
+      <w:tr>
+        <w:tc>
+          <w:tcPr>
+            <w:tcW w:type="dxa" w:w="2160"/>
+          </w:tcPr>
+          <w:p>
+            <w:r>
               <w:t>hepatitis</w:t>
             </w:r>
           </w:p>
@@ -610,6 +652,48 @@
           <w:p>
             <w:r>
               <w:t>19</w:t>
+            </w:r>
+          </w:p>
+        </w:tc>
+        <w:tc>
+          <w:tcPr>
+            <w:tcW w:type="dxa" w:w="2160"/>
+          </w:tcPr>
+          <w:p>
+            <w:r>
+              <w:t>UCI ML Repository</w:t>
+            </w:r>
+          </w:p>
+        </w:tc>
+      </w:tr>
+      <w:tr>
+        <w:tc>
+          <w:tcPr>
+            <w:tcW w:type="dxa" w:w="2160"/>
+          </w:tcPr>
+          <w:p>
+            <w:r>
+              <w:t>lymphography</w:t>
+            </w:r>
+          </w:p>
+        </w:tc>
+        <w:tc>
+          <w:tcPr>
+            <w:tcW w:type="dxa" w:w="2160"/>
+          </w:tcPr>
+          <w:p>
+            <w:r>
+              <w:t>148</w:t>
+            </w:r>
+          </w:p>
+        </w:tc>
+        <w:tc>
+          <w:tcPr>
+            <w:tcW w:type="dxa" w:w="2160"/>
+          </w:tcPr>
+          <w:p>
+            <w:r>
+              <w:t>18</w:t>
             </w:r>
           </w:p>
         </w:tc>
@@ -1347,6 +1431,306 @@
         <w:rPr>
           <w:rFonts w:ascii="Times New Roman" w:hAnsi="Times New Roman"/>
         </w:rPr>
+        <w:t>Dataset: dermatology</w:t>
+      </w:r>
+    </w:p>
+    <w:tbl>
+      <w:tblPr>
+        <w:tblStyle w:val="TableGrid"/>
+        <w:tblW w:type="auto" w:w="0"/>
+        <w:tblLook w:firstColumn="1" w:firstRow="1" w:lastColumn="0" w:lastRow="0" w:noHBand="0" w:noVBand="1" w:val="04A0"/>
+      </w:tblPr>
+      <w:tblGrid>
+        <w:gridCol w:w="1728"/>
+        <w:gridCol w:w="1728"/>
+        <w:gridCol w:w="1728"/>
+        <w:gridCol w:w="1728"/>
+        <w:gridCol w:w="1728"/>
+      </w:tblGrid>
+      <w:tr>
+        <w:tc>
+          <w:tcPr>
+            <w:tcW w:type="dxa" w:w="1728"/>
+          </w:tcPr>
+          <w:p>
+            <w:r>
+              <w:rPr>
+                <w:b/>
+              </w:rPr>
+              <w:t>Model</w:t>
+            </w:r>
+          </w:p>
+        </w:tc>
+        <w:tc>
+          <w:tcPr>
+            <w:tcW w:type="dxa" w:w="1728"/>
+          </w:tcPr>
+          <w:p>
+            <w:r>
+              <w:rPr>
+                <w:b/>
+              </w:rPr>
+              <w:t>ROC AUC</w:t>
+            </w:r>
+          </w:p>
+        </w:tc>
+        <w:tc>
+          <w:tcPr>
+            <w:tcW w:type="dxa" w:w="1728"/>
+          </w:tcPr>
+          <w:p>
+            <w:r>
+              <w:rPr>
+                <w:b/>
+              </w:rPr>
+              <w:t>Balanced acc</w:t>
+            </w:r>
+          </w:p>
+        </w:tc>
+        <w:tc>
+          <w:tcPr>
+            <w:tcW w:type="dxa" w:w="1728"/>
+          </w:tcPr>
+          <w:p>
+            <w:r>
+              <w:rPr>
+                <w:b/>
+              </w:rPr>
+              <w:t>Brier</w:t>
+            </w:r>
+          </w:p>
+        </w:tc>
+        <w:tc>
+          <w:tcPr>
+            <w:tcW w:type="dxa" w:w="1728"/>
+          </w:tcPr>
+          <w:p>
+            <w:r>
+              <w:rPr>
+                <w:b/>
+              </w:rPr>
+              <w:t>ECE</w:t>
+            </w:r>
+          </w:p>
+        </w:tc>
+      </w:tr>
+      <w:tr>
+        <w:tc>
+          <w:tcPr>
+            <w:tcW w:type="dxa" w:w="1728"/>
+          </w:tcPr>
+          <w:p>
+            <w:r>
+              <w:t>mlp</w:t>
+            </w:r>
+          </w:p>
+        </w:tc>
+        <w:tc>
+          <w:tcPr>
+            <w:tcW w:type="dxa" w:w="1728"/>
+          </w:tcPr>
+          <w:p>
+            <w:r>
+              <w:t>1.0000 +- 0.0000</w:t>
+            </w:r>
+          </w:p>
+        </w:tc>
+        <w:tc>
+          <w:tcPr>
+            <w:tcW w:type="dxa" w:w="1728"/>
+          </w:tcPr>
+          <w:p>
+            <w:r>
+              <w:t>1.0000</w:t>
+            </w:r>
+          </w:p>
+        </w:tc>
+        <w:tc>
+          <w:tcPr>
+            <w:tcW w:type="dxa" w:w="1728"/>
+          </w:tcPr>
+          <w:p>
+            <w:r>
+              <w:t>0.0000</w:t>
+            </w:r>
+          </w:p>
+        </w:tc>
+        <w:tc>
+          <w:tcPr>
+            <w:tcW w:type="dxa" w:w="1728"/>
+          </w:tcPr>
+          <w:p>
+            <w:r>
+              <w:t>0.0012</w:t>
+            </w:r>
+          </w:p>
+        </w:tc>
+      </w:tr>
+      <w:tr>
+        <w:tc>
+          <w:tcPr>
+            <w:tcW w:type="dxa" w:w="1728"/>
+          </w:tcPr>
+          <w:p>
+            <w:r>
+              <w:t>gcn</w:t>
+            </w:r>
+          </w:p>
+        </w:tc>
+        <w:tc>
+          <w:tcPr>
+            <w:tcW w:type="dxa" w:w="1728"/>
+          </w:tcPr>
+          <w:p>
+            <w:r>
+              <w:t>1.0000 +- 0.0000</w:t>
+            </w:r>
+          </w:p>
+        </w:tc>
+        <w:tc>
+          <w:tcPr>
+            <w:tcW w:type="dxa" w:w="1728"/>
+          </w:tcPr>
+          <w:p>
+            <w:r>
+              <w:t>1.0000</w:t>
+            </w:r>
+          </w:p>
+        </w:tc>
+        <w:tc>
+          <w:tcPr>
+            <w:tcW w:type="dxa" w:w="1728"/>
+          </w:tcPr>
+          <w:p>
+            <w:r>
+              <w:t>0.0002</w:t>
+            </w:r>
+          </w:p>
+        </w:tc>
+        <w:tc>
+          <w:tcPr>
+            <w:tcW w:type="dxa" w:w="1728"/>
+          </w:tcPr>
+          <w:p>
+            <w:r>
+              <w:t>0.0028</w:t>
+            </w:r>
+          </w:p>
+        </w:tc>
+      </w:tr>
+      <w:tr>
+        <w:tc>
+          <w:tcPr>
+            <w:tcW w:type="dxa" w:w="1728"/>
+          </w:tcPr>
+          <w:p>
+            <w:r>
+              <w:t>logreg</w:t>
+            </w:r>
+          </w:p>
+        </w:tc>
+        <w:tc>
+          <w:tcPr>
+            <w:tcW w:type="dxa" w:w="1728"/>
+          </w:tcPr>
+          <w:p>
+            <w:r>
+              <w:t>1.0000 +- 0.0000</w:t>
+            </w:r>
+          </w:p>
+        </w:tc>
+        <w:tc>
+          <w:tcPr>
+            <w:tcW w:type="dxa" w:w="1728"/>
+          </w:tcPr>
+          <w:p>
+            <w:r>
+              <w:t>1.0000</w:t>
+            </w:r>
+          </w:p>
+        </w:tc>
+        <w:tc>
+          <w:tcPr>
+            <w:tcW w:type="dxa" w:w="1728"/>
+          </w:tcPr>
+          <w:p>
+            <w:r>
+              <w:t>0.0013</w:t>
+            </w:r>
+          </w:p>
+        </w:tc>
+        <w:tc>
+          <w:tcPr>
+            <w:tcW w:type="dxa" w:w="1728"/>
+          </w:tcPr>
+          <w:p>
+            <w:r>
+              <w:t>0.0117</w:t>
+            </w:r>
+          </w:p>
+        </w:tc>
+      </w:tr>
+      <w:tr>
+        <w:tc>
+          <w:tcPr>
+            <w:tcW w:type="dxa" w:w="1728"/>
+          </w:tcPr>
+          <w:p>
+            <w:r>
+              <w:t>random_forest</w:t>
+            </w:r>
+          </w:p>
+        </w:tc>
+        <w:tc>
+          <w:tcPr>
+            <w:tcW w:type="dxa" w:w="1728"/>
+          </w:tcPr>
+          <w:p>
+            <w:r>
+              <w:t>1.0000 +- 0.0000</w:t>
+            </w:r>
+          </w:p>
+        </w:tc>
+        <w:tc>
+          <w:tcPr>
+            <w:tcW w:type="dxa" w:w="1728"/>
+          </w:tcPr>
+          <w:p>
+            <w:r>
+              <w:t>1.0000</w:t>
+            </w:r>
+          </w:p>
+        </w:tc>
+        <w:tc>
+          <w:tcPr>
+            <w:tcW w:type="dxa" w:w="1728"/>
+          </w:tcPr>
+          <w:p>
+            <w:r>
+              <w:t>0.0059</w:t>
+            </w:r>
+          </w:p>
+        </w:tc>
+        <w:tc>
+          <w:tcPr>
+            <w:tcW w:type="dxa" w:w="1728"/>
+          </w:tcPr>
+          <w:p>
+            <w:r>
+              <w:t>0.0346</w:t>
+            </w:r>
+          </w:p>
+        </w:tc>
+      </w:tr>
+    </w:tbl>
+    <w:p>
+      <w:pPr>
+        <w:pStyle w:val="Heading2"/>
+      </w:pPr>
+      <w:r>
+        <w:rPr>
+          <w:rFonts w:ascii="Times New Roman" w:hAnsi="Times New Roman"/>
+        </w:rPr>
         <w:t>Dataset: haberman</w:t>
       </w:r>
     </w:p>
@@ -2847,6 +3231,306 @@
         <w:rPr>
           <w:rFonts w:ascii="Times New Roman" w:hAnsi="Times New Roman"/>
         </w:rPr>
+        <w:t>Dataset: lymphography</w:t>
+      </w:r>
+    </w:p>
+    <w:tbl>
+      <w:tblPr>
+        <w:tblStyle w:val="TableGrid"/>
+        <w:tblW w:type="auto" w:w="0"/>
+        <w:tblLook w:firstColumn="1" w:firstRow="1" w:lastColumn="0" w:lastRow="0" w:noHBand="0" w:noVBand="1" w:val="04A0"/>
+      </w:tblPr>
+      <w:tblGrid>
+        <w:gridCol w:w="1728"/>
+        <w:gridCol w:w="1728"/>
+        <w:gridCol w:w="1728"/>
+        <w:gridCol w:w="1728"/>
+        <w:gridCol w:w="1728"/>
+      </w:tblGrid>
+      <w:tr>
+        <w:tc>
+          <w:tcPr>
+            <w:tcW w:type="dxa" w:w="1728"/>
+          </w:tcPr>
+          <w:p>
+            <w:r>
+              <w:rPr>
+                <w:b/>
+              </w:rPr>
+              <w:t>Model</w:t>
+            </w:r>
+          </w:p>
+        </w:tc>
+        <w:tc>
+          <w:tcPr>
+            <w:tcW w:type="dxa" w:w="1728"/>
+          </w:tcPr>
+          <w:p>
+            <w:r>
+              <w:rPr>
+                <w:b/>
+              </w:rPr>
+              <w:t>ROC AUC</w:t>
+            </w:r>
+          </w:p>
+        </w:tc>
+        <w:tc>
+          <w:tcPr>
+            <w:tcW w:type="dxa" w:w="1728"/>
+          </w:tcPr>
+          <w:p>
+            <w:r>
+              <w:rPr>
+                <w:b/>
+              </w:rPr>
+              <w:t>Balanced acc</w:t>
+            </w:r>
+          </w:p>
+        </w:tc>
+        <w:tc>
+          <w:tcPr>
+            <w:tcW w:type="dxa" w:w="1728"/>
+          </w:tcPr>
+          <w:p>
+            <w:r>
+              <w:rPr>
+                <w:b/>
+              </w:rPr>
+              <w:t>Brier</w:t>
+            </w:r>
+          </w:p>
+        </w:tc>
+        <w:tc>
+          <w:tcPr>
+            <w:tcW w:type="dxa" w:w="1728"/>
+          </w:tcPr>
+          <w:p>
+            <w:r>
+              <w:rPr>
+                <w:b/>
+              </w:rPr>
+              <w:t>ECE</w:t>
+            </w:r>
+          </w:p>
+        </w:tc>
+      </w:tr>
+      <w:tr>
+        <w:tc>
+          <w:tcPr>
+            <w:tcW w:type="dxa" w:w="1728"/>
+          </w:tcPr>
+          <w:p>
+            <w:r>
+              <w:t>mlp</w:t>
+            </w:r>
+          </w:p>
+        </w:tc>
+        <w:tc>
+          <w:tcPr>
+            <w:tcW w:type="dxa" w:w="1728"/>
+          </w:tcPr>
+          <w:p>
+            <w:r>
+              <w:t>0.8978 +- 0.0388</w:t>
+            </w:r>
+          </w:p>
+        </w:tc>
+        <w:tc>
+          <w:tcPr>
+            <w:tcW w:type="dxa" w:w="1728"/>
+          </w:tcPr>
+          <w:p>
+            <w:r>
+              <w:t>0.8457</w:t>
+            </w:r>
+          </w:p>
+        </w:tc>
+        <w:tc>
+          <w:tcPr>
+            <w:tcW w:type="dxa" w:w="1728"/>
+          </w:tcPr>
+          <w:p>
+            <w:r>
+              <w:t>0.1192</w:t>
+            </w:r>
+          </w:p>
+        </w:tc>
+        <w:tc>
+          <w:tcPr>
+            <w:tcW w:type="dxa" w:w="1728"/>
+          </w:tcPr>
+          <w:p>
+            <w:r>
+              <w:t>0.1647</w:t>
+            </w:r>
+          </w:p>
+        </w:tc>
+      </w:tr>
+      <w:tr>
+        <w:tc>
+          <w:tcPr>
+            <w:tcW w:type="dxa" w:w="1728"/>
+          </w:tcPr>
+          <w:p>
+            <w:r>
+              <w:t>gcn</w:t>
+            </w:r>
+          </w:p>
+        </w:tc>
+        <w:tc>
+          <w:tcPr>
+            <w:tcW w:type="dxa" w:w="1728"/>
+          </w:tcPr>
+          <w:p>
+            <w:r>
+              <w:t>0.8492 +- 0.0258</w:t>
+            </w:r>
+          </w:p>
+        </w:tc>
+        <w:tc>
+          <w:tcPr>
+            <w:tcW w:type="dxa" w:w="1728"/>
+          </w:tcPr>
+          <w:p>
+            <w:r>
+              <w:t>0.7852</w:t>
+            </w:r>
+          </w:p>
+        </w:tc>
+        <w:tc>
+          <w:tcPr>
+            <w:tcW w:type="dxa" w:w="1728"/>
+          </w:tcPr>
+          <w:p>
+            <w:r>
+              <w:t>0.1444</w:t>
+            </w:r>
+          </w:p>
+        </w:tc>
+        <w:tc>
+          <w:tcPr>
+            <w:tcW w:type="dxa" w:w="1728"/>
+          </w:tcPr>
+          <w:p>
+            <w:r>
+              <w:t>0.1595</w:t>
+            </w:r>
+          </w:p>
+        </w:tc>
+      </w:tr>
+      <w:tr>
+        <w:tc>
+          <w:tcPr>
+            <w:tcW w:type="dxa" w:w="1728"/>
+          </w:tcPr>
+          <w:p>
+            <w:r>
+              <w:t>logreg</w:t>
+            </w:r>
+          </w:p>
+        </w:tc>
+        <w:tc>
+          <w:tcPr>
+            <w:tcW w:type="dxa" w:w="1728"/>
+          </w:tcPr>
+          <w:p>
+            <w:r>
+              <w:t>0.8403 +- 0.0501</w:t>
+            </w:r>
+          </w:p>
+        </w:tc>
+        <w:tc>
+          <w:tcPr>
+            <w:tcW w:type="dxa" w:w="1728"/>
+          </w:tcPr>
+          <w:p>
+            <w:r>
+              <w:t>0.7956</w:t>
+            </w:r>
+          </w:p>
+        </w:tc>
+        <w:tc>
+          <w:tcPr>
+            <w:tcW w:type="dxa" w:w="1728"/>
+          </w:tcPr>
+          <w:p>
+            <w:r>
+              <w:t>0.1515</w:t>
+            </w:r>
+          </w:p>
+        </w:tc>
+        <w:tc>
+          <w:tcPr>
+            <w:tcW w:type="dxa" w:w="1728"/>
+          </w:tcPr>
+          <w:p>
+            <w:r>
+              <w:t>0.1593</w:t>
+            </w:r>
+          </w:p>
+        </w:tc>
+      </w:tr>
+      <w:tr>
+        <w:tc>
+          <w:tcPr>
+            <w:tcW w:type="dxa" w:w="1728"/>
+          </w:tcPr>
+          <w:p>
+            <w:r>
+              <w:t>random_forest</w:t>
+            </w:r>
+          </w:p>
+        </w:tc>
+        <w:tc>
+          <w:tcPr>
+            <w:tcW w:type="dxa" w:w="1728"/>
+          </w:tcPr>
+          <w:p>
+            <w:r>
+              <w:t>0.9107 +- 0.0462</w:t>
+            </w:r>
+          </w:p>
+        </w:tc>
+        <w:tc>
+          <w:tcPr>
+            <w:tcW w:type="dxa" w:w="1728"/>
+          </w:tcPr>
+          <w:p>
+            <w:r>
+              <w:t>0.8175</w:t>
+            </w:r>
+          </w:p>
+        </w:tc>
+        <w:tc>
+          <w:tcPr>
+            <w:tcW w:type="dxa" w:w="1728"/>
+          </w:tcPr>
+          <w:p>
+            <w:r>
+              <w:t>0.1228</w:t>
+            </w:r>
+          </w:p>
+        </w:tc>
+        <w:tc>
+          <w:tcPr>
+            <w:tcW w:type="dxa" w:w="1728"/>
+          </w:tcPr>
+          <w:p>
+            <w:r>
+              <w:t>0.1362</w:t>
+            </w:r>
+          </w:p>
+        </w:tc>
+      </w:tr>
+    </w:tbl>
+    <w:p>
+      <w:pPr>
+        <w:pStyle w:val="Heading2"/>
+      </w:pPr>
+      <w:r>
+        <w:rPr>
+          <w:rFonts w:ascii="Times New Roman" w:hAnsi="Times New Roman"/>
+        </w:rPr>
         <w:t>Dataset: spectf</w:t>
       </w:r>
     </w:p>
@@ -5359,37 +6043,37 @@
           </w:tcPr>
           <w:p>
             <w:r>
-              <w:t>0.9897</w:t>
-            </w:r>
-          </w:p>
-        </w:tc>
-        <w:tc>
-          <w:tcPr>
-            <w:tcW w:type="dxa" w:w="1728"/>
-          </w:tcPr>
-          <w:p>
-            <w:r>
-              <w:t>0.9893</w:t>
-            </w:r>
-          </w:p>
-        </w:tc>
-        <w:tc>
-          <w:tcPr>
-            <w:tcW w:type="dxa" w:w="1728"/>
-          </w:tcPr>
-          <w:p>
-            <w:r>
-              <w:t>+0.0004</w:t>
-            </w:r>
-          </w:p>
-        </w:tc>
-        <w:tc>
-          <w:tcPr>
-            <w:tcW w:type="dxa" w:w="1728"/>
-          </w:tcPr>
-          <w:p>
-            <w:r>
-              <w:t>[0.0023, -0.0002, 0.0004, -0.0053, 0.0049]</w:t>
+              <w:t>0.9894</w:t>
+            </w:r>
+          </w:p>
+        </w:tc>
+        <w:tc>
+          <w:tcPr>
+            <w:tcW w:type="dxa" w:w="1728"/>
+          </w:tcPr>
+          <w:p>
+            <w:r>
+              <w:t>0.9888</w:t>
+            </w:r>
+          </w:p>
+        </w:tc>
+        <w:tc>
+          <w:tcPr>
+            <w:tcW w:type="dxa" w:w="1728"/>
+          </w:tcPr>
+          <w:p>
+            <w:r>
+              <w:t>+0.0006</w:t>
+            </w:r>
+          </w:p>
+        </w:tc>
+        <w:tc>
+          <w:tcPr>
+            <w:tcW w:type="dxa" w:w="1728"/>
+          </w:tcPr>
+          <w:p>
+            <w:r>
+              <w:t>[0.004, 0.0006, 0.0019, -0.0013, -0.0021]</w:t>
             </w:r>
           </w:p>
         </w:tc>
@@ -5411,37 +6095,37 @@
           </w:tcPr>
           <w:p>
             <w:r>
-              <w:t>0.8273</w:t>
-            </w:r>
-          </w:p>
-        </w:tc>
-        <w:tc>
-          <w:tcPr>
-            <w:tcW w:type="dxa" w:w="1728"/>
-          </w:tcPr>
-          <w:p>
-            <w:r>
-              <w:t>0.8171</w:t>
-            </w:r>
-          </w:p>
-        </w:tc>
-        <w:tc>
-          <w:tcPr>
-            <w:tcW w:type="dxa" w:w="1728"/>
-          </w:tcPr>
-          <w:p>
-            <w:r>
-              <w:t>+0.0102</w:t>
-            </w:r>
-          </w:p>
-        </w:tc>
-        <w:tc>
-          <w:tcPr>
-            <w:tcW w:type="dxa" w:w="1728"/>
-          </w:tcPr>
-          <w:p>
-            <w:r>
-              <w:t>[0.0118, 0.0195, -0.0007, 0.0118, 0.0084]</w:t>
+              <w:t>0.8308</w:t>
+            </w:r>
+          </w:p>
+        </w:tc>
+        <w:tc>
+          <w:tcPr>
+            <w:tcW w:type="dxa" w:w="1728"/>
+          </w:tcPr>
+          <w:p>
+            <w:r>
+              <w:t>0.8270</w:t>
+            </w:r>
+          </w:p>
+        </w:tc>
+        <w:tc>
+          <w:tcPr>
+            <w:tcW w:type="dxa" w:w="1728"/>
+          </w:tcPr>
+          <w:p>
+            <w:r>
+              <w:t>+0.0038</w:t>
+            </w:r>
+          </w:p>
+        </w:tc>
+        <w:tc>
+          <w:tcPr>
+            <w:tcW w:type="dxa" w:w="1728"/>
+          </w:tcPr>
+          <w:p>
+            <w:r>
+              <w:t>[-0.0105, 0.0021, 0.0028, 0.0251, -0.0007]</w:t>
             </w:r>
           </w:p>
         </w:tc>
@@ -5463,37 +6147,37 @@
           </w:tcPr>
           <w:p>
             <w:r>
-              <w:t>0.7621</w:t>
-            </w:r>
-          </w:p>
-        </w:tc>
-        <w:tc>
-          <w:tcPr>
-            <w:tcW w:type="dxa" w:w="1728"/>
-          </w:tcPr>
-          <w:p>
-            <w:r>
-              <w:t>0.7555</w:t>
-            </w:r>
-          </w:p>
-        </w:tc>
-        <w:tc>
-          <w:tcPr>
-            <w:tcW w:type="dxa" w:w="1728"/>
-          </w:tcPr>
-          <w:p>
-            <w:r>
-              <w:t>+0.0066</w:t>
-            </w:r>
-          </w:p>
-        </w:tc>
-        <w:tc>
-          <w:tcPr>
-            <w:tcW w:type="dxa" w:w="1728"/>
-          </w:tcPr>
-          <w:p>
-            <w:r>
-              <w:t>[0.0045, 0.0032, 0.0208, 0.0005, 0.0041]</w:t>
+              <w:t>0.7694</w:t>
+            </w:r>
+          </w:p>
+        </w:tc>
+        <w:tc>
+          <w:tcPr>
+            <w:tcW w:type="dxa" w:w="1728"/>
+          </w:tcPr>
+          <w:p>
+            <w:r>
+              <w:t>0.7607</w:t>
+            </w:r>
+          </w:p>
+        </w:tc>
+        <w:tc>
+          <w:tcPr>
+            <w:tcW w:type="dxa" w:w="1728"/>
+          </w:tcPr>
+          <w:p>
+            <w:r>
+              <w:t>+0.0086</w:t>
+            </w:r>
+          </w:p>
+        </w:tc>
+        <w:tc>
+          <w:tcPr>
+            <w:tcW w:type="dxa" w:w="1728"/>
+          </w:tcPr>
+          <w:p>
+            <w:r>
+              <w:t>[0.0294, 0.0006, 0.0134, 0.0048, -0.005]</w:t>
             </w:r>
           </w:p>
         </w:tc>
@@ -5515,37 +6199,37 @@
           </w:tcPr>
           <w:p>
             <w:r>
-              <w:t>0.9248</w:t>
-            </w:r>
-          </w:p>
-        </w:tc>
-        <w:tc>
-          <w:tcPr>
-            <w:tcW w:type="dxa" w:w="1728"/>
-          </w:tcPr>
-          <w:p>
-            <w:r>
-              <w:t>0.9108</w:t>
-            </w:r>
-          </w:p>
-        </w:tc>
-        <w:tc>
-          <w:tcPr>
-            <w:tcW w:type="dxa" w:w="1728"/>
-          </w:tcPr>
-          <w:p>
-            <w:r>
-              <w:t>+0.0140</w:t>
-            </w:r>
-          </w:p>
-        </w:tc>
-        <w:tc>
-          <w:tcPr>
-            <w:tcW w:type="dxa" w:w="1728"/>
-          </w:tcPr>
-          <w:p>
-            <w:r>
-              <w:t>[0.0293, 0.0473, 0.0, -0.0045, -0.0023]</w:t>
+              <w:t>0.9009</w:t>
+            </w:r>
+          </w:p>
+        </w:tc>
+        <w:tc>
+          <w:tcPr>
+            <w:tcW w:type="dxa" w:w="1728"/>
+          </w:tcPr>
+          <w:p>
+            <w:r>
+              <w:t>0.9027</w:t>
+            </w:r>
+          </w:p>
+        </w:tc>
+        <w:tc>
+          <w:tcPr>
+            <w:tcW w:type="dxa" w:w="1728"/>
+          </w:tcPr>
+          <w:p>
+            <w:r>
+              <w:t>-0.0018</w:t>
+            </w:r>
+          </w:p>
+        </w:tc>
+        <w:tc>
+          <w:tcPr>
+            <w:tcW w:type="dxa" w:w="1728"/>
+          </w:tcPr>
+          <w:p>
+            <w:r>
+              <w:t>[0.0315, 0.0203, -0.0428, 0.0135, -0.0315]</w:t>
             </w:r>
           </w:p>
         </w:tc>
@@ -5553,7 +6237,7 @@
     </w:tbl>
     <w:p>
       <w:r>
-        <w:t>Stable bridges (seed recurrence &gt;= 4/5): [{"pair": "wdbc&lt;-&gt;cleveland", "seed_recurrence": 5, "endpoint_label_counts": {"1-0": 379, "1-1": 1230, "0-0": 821, "0-1": 371}}, {"pair": "wdbc&lt;-&gt;pima", "seed_recurrence": 5, "endpoint_label_counts": {"1-0": 1091, "1-1": 2321, "0-0": 3549, "0-1": 1081}}, {"pair": "wdbc&lt;-&gt;parkinsons", "seed_recurrence": 5, "endpoint_label_counts": {"1-1": 733, "0-1": 1221, "0-0": 57, "1-0": 15}}, {"pair": "cleveland&lt;-&gt;pima", "seed_recurrence": 5, "endpoint_label_counts": {"0-0": 1818, "0-1": 670, "1-1": 1039, "1-0": 1585}}, {"pair": "cleveland&lt;-&gt;parkinsons", "seed_recurrence": 5, "endpoint_label_counts": {"1-1": 546, "0-1": 804, "0-0": 155, "1-0": 154}}, {"pair": "pima&lt;-&gt;parkinsons", "seed_recurrence": 5, "endpoint_label_counts": {"1-1": 759, "1-0": 205, "0-1": 1101, "0-0": 255}}]</w:t>
+        <w:t>Stable bridges (seed recurrence &gt;= 4/5): [{"pair": "wdbc&lt;-&gt;cleveland", "seed_recurrence": 5, "endpoint_label_counts": {"1-0": 387, "1-1": 1237, "0-0": 829, "0-1": 380}}, {"pair": "wdbc&lt;-&gt;pima", "seed_recurrence": 5, "endpoint_label_counts": {"1-0": 1104, "1-1": 2333, "0-0": 3575, "0-1": 1092}}, {"pair": "wdbc&lt;-&gt;parkinsons", "seed_recurrence": 5, "endpoint_label_counts": {"1-1": 757, "0-1": 1249, "0-0": 68, "1-0": 24}}, {"pair": "cleveland&lt;-&gt;pima", "seed_recurrence": 5, "endpoint_label_counts": {"0-0": 1793, "0-1": 657, "1-1": 1029, "1-0": 1565}}, {"pair": "cleveland&lt;-&gt;parkinsons", "seed_recurrence": 5, "endpoint_label_counts": {"1-1": 579, "0-1": 823, "0-0": 167, "1-0": 171}}, {"pair": "pima&lt;-&gt;parkinsons", "seed_recurrence": 5, "endpoint_label_counts": {"1-1": 764, "1-0": 212, "0-1": 1094, "0-0": 255}}]</w:t>
       </w:r>
     </w:p>
     <w:p>
@@ -6309,6 +6993,104 @@
         </w:tc>
       </w:tr>
     </w:tbl>
+    <w:p>
+      <w:pPr>
+        <w:pStyle w:val="Heading1"/>
+      </w:pPr>
+      <w:r>
+        <w:rPr>
+          <w:rFonts w:ascii="Times New Roman" w:hAnsi="Times New Roman"/>
+        </w:rPr>
+        <w:t>Related work</w:t>
+      </w:r>
+    </w:p>
+    <w:p>
+      <w:r>
+        <w:t>WDBC has been a benchmark since Street, Wolberg and Mangasarian (1993)</w:t>
+        <w:br/>
+        <w:t>introduced the ten cytological features; reported accuracies climbed from</w:t>
+        <w:br/>
+        <w:t>97 percent with simple linear models to claims above 99 percent under</w:t>
+        <w:br/>
+        <w:t>feature-selection pipelines (PeerJ Computer Science 2024 reports logistic</w:t>
+        <w:br/>
+        <w:t>regression at 97.5 percent; a 2022 preprocessing-plus-selection pipeline</w:t>
+        <w:br/>
+        <w:t>claims 99.12 percent). The Cleveland heart-disease cohort of Detrano et</w:t>
+        <w:br/>
+        <w:t>al. (1989) shows the same inflation curve, with tuned single-split neural</w:t>
+        <w:br/>
+        <w:t>networks reported above 93 percent accuracy and XGBoost at 90 percent</w:t>
+        <w:br/>
+        <w:t>under stricter evaluation. For Pima diabetes, gradient boosting claims</w:t>
+        <w:br/>
+        <w:t>range from 85 to 91 percent accuracy depending on protocol, and for the</w:t>
+        <w:br/>
+        <w:t>Parkinson's vocal dataset recent claims reach 99.11 percent with feedforward</w:t>
+        <w:br/>
+        <w:t>networks. Two observations motivate our protocol: first, the spread within</w:t>
+        <w:br/>
+        <w:t>a dataset across papers is larger than the spread between model families,</w:t>
+        <w:br/>
+        <w:t>which is the signature of protocol variance rather than model progress;</w:t>
+        <w:br/>
+        <w:t>second, almost none of these works report calibration, which is the metric</w:t>
+        <w:br/>
+        <w:t>that decides whether a score can be thresholded clinically. Graph neural</w:t>
+        <w:br/>
+        <w:t>networks for tabular clinical data remain comparatively unexplored outside</w:t>
+        <w:br/>
+        <w:t>medical imaging; our transductive patient-graph construction follows the</w:t>
+        <w:br/>
+        <w:t>semi-supervised classification line of Kipf and Welling (2017) and the</w:t>
+        <w:br/>
+        <w:t>self-tuning spectral clustering of Zelnik-Manor and Perona (2004), and our</w:t>
+        <w:br/>
+        <w:t>label-efficiency framing connects to the broader semi-supervised learning</w:t>
+        <w:br/>
+        <w:t>literature, adapted here to cohorts of a few hundred patients.</w:t>
+      </w:r>
+    </w:p>
+    <w:p>
+      <w:pPr>
+        <w:pStyle w:val="Heading1"/>
+      </w:pPr>
+      <w:r>
+        <w:rPr>
+          <w:rFonts w:ascii="Times New Roman" w:hAnsi="Times New Roman"/>
+        </w:rPr>
+        <w:t>Protocol and reproducibility</w:t>
+      </w:r>
+    </w:p>
+    <w:p>
+      <w:r>
+        <w:t>Compute environment. All experiments ran on a two-core CPU sandbox with</w:t>
+        <w:br/>
+        <w:t>2 GB RAM; no GPU was used. This constrains model size deliberately: every</w:t>
+        <w:br/>
+        <w:t>architecture in this paper trains in under five minutes per seed on this</w:t>
+        <w:br/>
+        <w:t>hardware, which makes the full suite reproducible on a laptop. Determinism</w:t>
+        <w:br/>
+        <w:t>is enforced by explicit seeding of NumPy and PyTorch; data splits are</w:t>
+        <w:br/>
+        <w:t>stratified with a fixed 75/25 train/test ratio; graph models carve a</w:t>
+        <w:br/>
+        <w:t>20 percent validation slice from the training indices for early stopping.</w:t>
+        <w:br/>
+        <w:t>The hermetic test suite (28 tests) validates every loader against recorded</w:t>
+        <w:br/>
+        <w:t>properties (shape, prevalence bounds, label coding), every model for</w:t>
+        <w:br/>
+        <w:t>output shape and finite loss, graph construction for symmetry and block</w:t>
+        <w:br/>
+        <w:t>structure, the metrics against hand-computed cases, and the discovery</w:t>
+        <w:br/>
+        <w:t>pipeline end-to-end on synthetic separable data. Tests never touch the</w:t>
+        <w:br/>
+        <w:t>network; live downloads happen only in the documented fetch layer.</w:t>
+      </w:r>
+    </w:p>
     <w:p>
       <w:pPr>
         <w:pStyle w:val="Heading1"/>
@@ -6991,6 +7773,174 @@
           <w:p>
             <w:r>
               <w:t>0.8580</w:t>
+            </w:r>
+          </w:p>
+        </w:tc>
+      </w:tr>
+      <w:tr>
+        <w:tc>
+          <w:tcPr>
+            <w:tcW w:type="dxa" w:w="2160"/>
+          </w:tcPr>
+          <w:p>
+            <w:r>
+              <w:t>pima</w:t>
+            </w:r>
+          </w:p>
+        </w:tc>
+        <w:tc>
+          <w:tcPr>
+            <w:tcW w:type="dxa" w:w="2160"/>
+          </w:tcPr>
+          <w:p>
+            <w:r>
+              <w:t>10%</w:t>
+            </w:r>
+          </w:p>
+        </w:tc>
+        <w:tc>
+          <w:tcPr>
+            <w:tcW w:type="dxa" w:w="2160"/>
+          </w:tcPr>
+          <w:p>
+            <w:r>
+              <w:t>0.7843</w:t>
+            </w:r>
+          </w:p>
+        </w:tc>
+        <w:tc>
+          <w:tcPr>
+            <w:tcW w:type="dxa" w:w="2160"/>
+          </w:tcPr>
+          <w:p>
+            <w:r>
+              <w:t>0.7231</w:t>
+            </w:r>
+          </w:p>
+        </w:tc>
+      </w:tr>
+      <w:tr>
+        <w:tc>
+          <w:tcPr>
+            <w:tcW w:type="dxa" w:w="2160"/>
+          </w:tcPr>
+          <w:p>
+            <w:r>
+              <w:t>pima</w:t>
+            </w:r>
+          </w:p>
+        </w:tc>
+        <w:tc>
+          <w:tcPr>
+            <w:tcW w:type="dxa" w:w="2160"/>
+          </w:tcPr>
+          <w:p>
+            <w:r>
+              <w:t>25%</w:t>
+            </w:r>
+          </w:p>
+        </w:tc>
+        <w:tc>
+          <w:tcPr>
+            <w:tcW w:type="dxa" w:w="2160"/>
+          </w:tcPr>
+          <w:p>
+            <w:r>
+              <w:t>0.7989</w:t>
+            </w:r>
+          </w:p>
+        </w:tc>
+        <w:tc>
+          <w:tcPr>
+            <w:tcW w:type="dxa" w:w="2160"/>
+          </w:tcPr>
+          <w:p>
+            <w:r>
+              <w:t>0.7908</w:t>
+            </w:r>
+          </w:p>
+        </w:tc>
+      </w:tr>
+      <w:tr>
+        <w:tc>
+          <w:tcPr>
+            <w:tcW w:type="dxa" w:w="2160"/>
+          </w:tcPr>
+          <w:p>
+            <w:r>
+              <w:t>pima</w:t>
+            </w:r>
+          </w:p>
+        </w:tc>
+        <w:tc>
+          <w:tcPr>
+            <w:tcW w:type="dxa" w:w="2160"/>
+          </w:tcPr>
+          <w:p>
+            <w:r>
+              <w:t>50%</w:t>
+            </w:r>
+          </w:p>
+        </w:tc>
+        <w:tc>
+          <w:tcPr>
+            <w:tcW w:type="dxa" w:w="2160"/>
+          </w:tcPr>
+          <w:p>
+            <w:r>
+              <w:t>0.8062</w:t>
+            </w:r>
+          </w:p>
+        </w:tc>
+        <w:tc>
+          <w:tcPr>
+            <w:tcW w:type="dxa" w:w="2160"/>
+          </w:tcPr>
+          <w:p>
+            <w:r>
+              <w:t>0.7953</w:t>
+            </w:r>
+          </w:p>
+        </w:tc>
+      </w:tr>
+      <w:tr>
+        <w:tc>
+          <w:tcPr>
+            <w:tcW w:type="dxa" w:w="2160"/>
+          </w:tcPr>
+          <w:p>
+            <w:r>
+              <w:t>pima</w:t>
+            </w:r>
+          </w:p>
+        </w:tc>
+        <w:tc>
+          <w:tcPr>
+            <w:tcW w:type="dxa" w:w="2160"/>
+          </w:tcPr>
+          <w:p>
+            <w:r>
+              <w:t>100%</w:t>
+            </w:r>
+          </w:p>
+        </w:tc>
+        <w:tc>
+          <w:tcPr>
+            <w:tcW w:type="dxa" w:w="2160"/>
+          </w:tcPr>
+          <w:p>
+            <w:r>
+              <w:t>0.8216</w:t>
+            </w:r>
+          </w:p>
+        </w:tc>
+        <w:tc>
+          <w:tcPr>
+            <w:tcW w:type="dxa" w:w="2160"/>
+          </w:tcPr>
+          <w:p>
+            <w:r>
+              <w:t>0.8039</w:t>
             </w:r>
           </w:p>
         </w:tc>

</xml_diff>

<commit_message>
label-eff figure + scoped claim with parkinsons failure mode
</commit_message>
<xml_diff>
--- a/paper/MEGA27-10-paper.docx
+++ b/paper/MEGA27-10-paper.docx
@@ -421,6 +421,48 @@
           </w:tcPr>
           <w:p>
             <w:r>
+              <w:t>arrhythmia</w:t>
+            </w:r>
+          </w:p>
+        </w:tc>
+        <w:tc>
+          <w:tcPr>
+            <w:tcW w:type="dxa" w:w="2160"/>
+          </w:tcPr>
+          <w:p>
+            <w:r>
+              <w:t>452</w:t>
+            </w:r>
+          </w:p>
+        </w:tc>
+        <w:tc>
+          <w:tcPr>
+            <w:tcW w:type="dxa" w:w="2160"/>
+          </w:tcPr>
+          <w:p>
+            <w:r>
+              <w:t>279</w:t>
+            </w:r>
+          </w:p>
+        </w:tc>
+        <w:tc>
+          <w:tcPr>
+            <w:tcW w:type="dxa" w:w="2160"/>
+          </w:tcPr>
+          <w:p>
+            <w:r>
+              <w:t>Guvenir et al. (1997), UCI</w:t>
+            </w:r>
+          </w:p>
+        </w:tc>
+      </w:tr>
+      <w:tr>
+        <w:tc>
+          <w:tcPr>
+            <w:tcW w:type="dxa" w:w="2160"/>
+          </w:tcPr>
+          <w:p>
+            <w:r>
               <w:t>dermatology</w:t>
             </w:r>
           </w:p>
@@ -452,6 +494,48 @@
           <w:p>
             <w:r>
               <w:t>Ilter &amp; Guvenir (1998), UCI</w:t>
+            </w:r>
+          </w:p>
+        </w:tc>
+      </w:tr>
+      <w:tr>
+        <w:tc>
+          <w:tcPr>
+            <w:tcW w:type="dxa" w:w="2160"/>
+          </w:tcPr>
+          <w:p>
+            <w:r>
+              <w:t>echocardiogram</w:t>
+            </w:r>
+          </w:p>
+        </w:tc>
+        <w:tc>
+          <w:tcPr>
+            <w:tcW w:type="dxa" w:w="2160"/>
+          </w:tcPr>
+          <w:p>
+            <w:r>
+              <w:t>131</w:t>
+            </w:r>
+          </w:p>
+        </w:tc>
+        <w:tc>
+          <w:tcPr>
+            <w:tcW w:type="dxa" w:w="2160"/>
+          </w:tcPr>
+          <w:p>
+            <w:r>
+              <w:t>9</w:t>
+            </w:r>
+          </w:p>
+        </w:tc>
+        <w:tc>
+          <w:tcPr>
+            <w:tcW w:type="dxa" w:w="2160"/>
+          </w:tcPr>
+          <w:p>
+            <w:r>
+              <w:t>UCI ML Repository</w:t>
             </w:r>
           </w:p>
         </w:tc>
@@ -1431,6 +1515,306 @@
         <w:rPr>
           <w:rFonts w:ascii="Times New Roman" w:hAnsi="Times New Roman"/>
         </w:rPr>
+        <w:t>Dataset: arrhythmia</w:t>
+      </w:r>
+    </w:p>
+    <w:tbl>
+      <w:tblPr>
+        <w:tblStyle w:val="TableGrid"/>
+        <w:tblW w:type="auto" w:w="0"/>
+        <w:tblLook w:firstColumn="1" w:firstRow="1" w:lastColumn="0" w:lastRow="0" w:noHBand="0" w:noVBand="1" w:val="04A0"/>
+      </w:tblPr>
+      <w:tblGrid>
+        <w:gridCol w:w="1728"/>
+        <w:gridCol w:w="1728"/>
+        <w:gridCol w:w="1728"/>
+        <w:gridCol w:w="1728"/>
+        <w:gridCol w:w="1728"/>
+      </w:tblGrid>
+      <w:tr>
+        <w:tc>
+          <w:tcPr>
+            <w:tcW w:type="dxa" w:w="1728"/>
+          </w:tcPr>
+          <w:p>
+            <w:r>
+              <w:rPr>
+                <w:b/>
+              </w:rPr>
+              <w:t>Model</w:t>
+            </w:r>
+          </w:p>
+        </w:tc>
+        <w:tc>
+          <w:tcPr>
+            <w:tcW w:type="dxa" w:w="1728"/>
+          </w:tcPr>
+          <w:p>
+            <w:r>
+              <w:rPr>
+                <w:b/>
+              </w:rPr>
+              <w:t>ROC AUC</w:t>
+            </w:r>
+          </w:p>
+        </w:tc>
+        <w:tc>
+          <w:tcPr>
+            <w:tcW w:type="dxa" w:w="1728"/>
+          </w:tcPr>
+          <w:p>
+            <w:r>
+              <w:rPr>
+                <w:b/>
+              </w:rPr>
+              <w:t>Balanced acc</w:t>
+            </w:r>
+          </w:p>
+        </w:tc>
+        <w:tc>
+          <w:tcPr>
+            <w:tcW w:type="dxa" w:w="1728"/>
+          </w:tcPr>
+          <w:p>
+            <w:r>
+              <w:rPr>
+                <w:b/>
+              </w:rPr>
+              <w:t>Brier</w:t>
+            </w:r>
+          </w:p>
+        </w:tc>
+        <w:tc>
+          <w:tcPr>
+            <w:tcW w:type="dxa" w:w="1728"/>
+          </w:tcPr>
+          <w:p>
+            <w:r>
+              <w:rPr>
+                <w:b/>
+              </w:rPr>
+              <w:t>ECE</w:t>
+            </w:r>
+          </w:p>
+        </w:tc>
+      </w:tr>
+      <w:tr>
+        <w:tc>
+          <w:tcPr>
+            <w:tcW w:type="dxa" w:w="1728"/>
+          </w:tcPr>
+          <w:p>
+            <w:r>
+              <w:t>mlp</w:t>
+            </w:r>
+          </w:p>
+        </w:tc>
+        <w:tc>
+          <w:tcPr>
+            <w:tcW w:type="dxa" w:w="1728"/>
+          </w:tcPr>
+          <w:p>
+            <w:r>
+              <w:t>0.8195 +- 0.0372</w:t>
+            </w:r>
+          </w:p>
+        </w:tc>
+        <w:tc>
+          <w:tcPr>
+            <w:tcW w:type="dxa" w:w="1728"/>
+          </w:tcPr>
+          <w:p>
+            <w:r>
+              <w:t>0.7519</w:t>
+            </w:r>
+          </w:p>
+        </w:tc>
+        <w:tc>
+          <w:tcPr>
+            <w:tcW w:type="dxa" w:w="1728"/>
+          </w:tcPr>
+          <w:p>
+            <w:r>
+              <w:t>0.1711</w:t>
+            </w:r>
+          </w:p>
+        </w:tc>
+        <w:tc>
+          <w:tcPr>
+            <w:tcW w:type="dxa" w:w="1728"/>
+          </w:tcPr>
+          <w:p>
+            <w:r>
+              <w:t>0.0730</w:t>
+            </w:r>
+          </w:p>
+        </w:tc>
+      </w:tr>
+      <w:tr>
+        <w:tc>
+          <w:tcPr>
+            <w:tcW w:type="dxa" w:w="1728"/>
+          </w:tcPr>
+          <w:p>
+            <w:r>
+              <w:t>gcn</w:t>
+            </w:r>
+          </w:p>
+        </w:tc>
+        <w:tc>
+          <w:tcPr>
+            <w:tcW w:type="dxa" w:w="1728"/>
+          </w:tcPr>
+          <w:p>
+            <w:r>
+              <w:t>0.7701 +- 0.0269</w:t>
+            </w:r>
+          </w:p>
+        </w:tc>
+        <w:tc>
+          <w:tcPr>
+            <w:tcW w:type="dxa" w:w="1728"/>
+          </w:tcPr>
+          <w:p>
+            <w:r>
+              <w:t>0.7075</w:t>
+            </w:r>
+          </w:p>
+        </w:tc>
+        <w:tc>
+          <w:tcPr>
+            <w:tcW w:type="dxa" w:w="1728"/>
+          </w:tcPr>
+          <w:p>
+            <w:r>
+              <w:t>0.1960</w:t>
+            </w:r>
+          </w:p>
+        </w:tc>
+        <w:tc>
+          <w:tcPr>
+            <w:tcW w:type="dxa" w:w="1728"/>
+          </w:tcPr>
+          <w:p>
+            <w:r>
+              <w:t>0.0976</w:t>
+            </w:r>
+          </w:p>
+        </w:tc>
+      </w:tr>
+      <w:tr>
+        <w:tc>
+          <w:tcPr>
+            <w:tcW w:type="dxa" w:w="1728"/>
+          </w:tcPr>
+          <w:p>
+            <w:r>
+              <w:t>logreg</w:t>
+            </w:r>
+          </w:p>
+        </w:tc>
+        <w:tc>
+          <w:tcPr>
+            <w:tcW w:type="dxa" w:w="1728"/>
+          </w:tcPr>
+          <w:p>
+            <w:r>
+              <w:t>0.7713 +- 0.0150</w:t>
+            </w:r>
+          </w:p>
+        </w:tc>
+        <w:tc>
+          <w:tcPr>
+            <w:tcW w:type="dxa" w:w="1728"/>
+          </w:tcPr>
+          <w:p>
+            <w:r>
+              <w:t>0.7086</w:t>
+            </w:r>
+          </w:p>
+        </w:tc>
+        <w:tc>
+          <w:tcPr>
+            <w:tcW w:type="dxa" w:w="1728"/>
+          </w:tcPr>
+          <w:p>
+            <w:r>
+              <w:t>0.2247</w:t>
+            </w:r>
+          </w:p>
+        </w:tc>
+        <w:tc>
+          <w:tcPr>
+            <w:tcW w:type="dxa" w:w="1728"/>
+          </w:tcPr>
+          <w:p>
+            <w:r>
+              <w:t>0.1977</w:t>
+            </w:r>
+          </w:p>
+        </w:tc>
+      </w:tr>
+      <w:tr>
+        <w:tc>
+          <w:tcPr>
+            <w:tcW w:type="dxa" w:w="1728"/>
+          </w:tcPr>
+          <w:p>
+            <w:r>
+              <w:t>random_forest</w:t>
+            </w:r>
+          </w:p>
+        </w:tc>
+        <w:tc>
+          <w:tcPr>
+            <w:tcW w:type="dxa" w:w="1728"/>
+          </w:tcPr>
+          <w:p>
+            <w:r>
+              <w:t>0.8724 +- 0.0205</w:t>
+            </w:r>
+          </w:p>
+        </w:tc>
+        <w:tc>
+          <w:tcPr>
+            <w:tcW w:type="dxa" w:w="1728"/>
+          </w:tcPr>
+          <w:p>
+            <w:r>
+              <w:t>0.8182</w:t>
+            </w:r>
+          </w:p>
+        </w:tc>
+        <w:tc>
+          <w:tcPr>
+            <w:tcW w:type="dxa" w:w="1728"/>
+          </w:tcPr>
+          <w:p>
+            <w:r>
+              <w:t>0.1554</w:t>
+            </w:r>
+          </w:p>
+        </w:tc>
+        <w:tc>
+          <w:tcPr>
+            <w:tcW w:type="dxa" w:w="1728"/>
+          </w:tcPr>
+          <w:p>
+            <w:r>
+              <w:t>0.1313</w:t>
+            </w:r>
+          </w:p>
+        </w:tc>
+      </w:tr>
+    </w:tbl>
+    <w:p>
+      <w:pPr>
+        <w:pStyle w:val="Heading2"/>
+      </w:pPr>
+      <w:r>
+        <w:rPr>
+          <w:rFonts w:ascii="Times New Roman" w:hAnsi="Times New Roman"/>
+        </w:rPr>
         <w:t>Dataset: dermatology</w:t>
       </w:r>
     </w:p>
@@ -1718,6 +2102,306 @@
           <w:p>
             <w:r>
               <w:t>0.0346</w:t>
+            </w:r>
+          </w:p>
+        </w:tc>
+      </w:tr>
+    </w:tbl>
+    <w:p>
+      <w:pPr>
+        <w:pStyle w:val="Heading2"/>
+      </w:pPr>
+      <w:r>
+        <w:rPr>
+          <w:rFonts w:ascii="Times New Roman" w:hAnsi="Times New Roman"/>
+        </w:rPr>
+        <w:t>Dataset: echocardiogram</w:t>
+      </w:r>
+    </w:p>
+    <w:tbl>
+      <w:tblPr>
+        <w:tblStyle w:val="TableGrid"/>
+        <w:tblW w:type="auto" w:w="0"/>
+        <w:tblLook w:firstColumn="1" w:firstRow="1" w:lastColumn="0" w:lastRow="0" w:noHBand="0" w:noVBand="1" w:val="04A0"/>
+      </w:tblPr>
+      <w:tblGrid>
+        <w:gridCol w:w="1728"/>
+        <w:gridCol w:w="1728"/>
+        <w:gridCol w:w="1728"/>
+        <w:gridCol w:w="1728"/>
+        <w:gridCol w:w="1728"/>
+      </w:tblGrid>
+      <w:tr>
+        <w:tc>
+          <w:tcPr>
+            <w:tcW w:type="dxa" w:w="1728"/>
+          </w:tcPr>
+          <w:p>
+            <w:r>
+              <w:rPr>
+                <w:b/>
+              </w:rPr>
+              <w:t>Model</w:t>
+            </w:r>
+          </w:p>
+        </w:tc>
+        <w:tc>
+          <w:tcPr>
+            <w:tcW w:type="dxa" w:w="1728"/>
+          </w:tcPr>
+          <w:p>
+            <w:r>
+              <w:rPr>
+                <w:b/>
+              </w:rPr>
+              <w:t>ROC AUC</w:t>
+            </w:r>
+          </w:p>
+        </w:tc>
+        <w:tc>
+          <w:tcPr>
+            <w:tcW w:type="dxa" w:w="1728"/>
+          </w:tcPr>
+          <w:p>
+            <w:r>
+              <w:rPr>
+                <w:b/>
+              </w:rPr>
+              <w:t>Balanced acc</w:t>
+            </w:r>
+          </w:p>
+        </w:tc>
+        <w:tc>
+          <w:tcPr>
+            <w:tcW w:type="dxa" w:w="1728"/>
+          </w:tcPr>
+          <w:p>
+            <w:r>
+              <w:rPr>
+                <w:b/>
+              </w:rPr>
+              <w:t>Brier</w:t>
+            </w:r>
+          </w:p>
+        </w:tc>
+        <w:tc>
+          <w:tcPr>
+            <w:tcW w:type="dxa" w:w="1728"/>
+          </w:tcPr>
+          <w:p>
+            <w:r>
+              <w:rPr>
+                <w:b/>
+              </w:rPr>
+              <w:t>ECE</w:t>
+            </w:r>
+          </w:p>
+        </w:tc>
+      </w:tr>
+      <w:tr>
+        <w:tc>
+          <w:tcPr>
+            <w:tcW w:type="dxa" w:w="1728"/>
+          </w:tcPr>
+          <w:p>
+            <w:r>
+              <w:t>mlp</w:t>
+            </w:r>
+          </w:p>
+        </w:tc>
+        <w:tc>
+          <w:tcPr>
+            <w:tcW w:type="dxa" w:w="1728"/>
+          </w:tcPr>
+          <w:p>
+            <w:r>
+              <w:t>0.8251 +- 0.0439</w:t>
+            </w:r>
+          </w:p>
+        </w:tc>
+        <w:tc>
+          <w:tcPr>
+            <w:tcW w:type="dxa" w:w="1728"/>
+          </w:tcPr>
+          <w:p>
+            <w:r>
+              <w:t>0.7197</w:t>
+            </w:r>
+          </w:p>
+        </w:tc>
+        <w:tc>
+          <w:tcPr>
+            <w:tcW w:type="dxa" w:w="1728"/>
+          </w:tcPr>
+          <w:p>
+            <w:r>
+              <w:t>0.1602</w:t>
+            </w:r>
+          </w:p>
+        </w:tc>
+        <w:tc>
+          <w:tcPr>
+            <w:tcW w:type="dxa" w:w="1728"/>
+          </w:tcPr>
+          <w:p>
+            <w:r>
+              <w:t>0.1459</w:t>
+            </w:r>
+          </w:p>
+        </w:tc>
+      </w:tr>
+      <w:tr>
+        <w:tc>
+          <w:tcPr>
+            <w:tcW w:type="dxa" w:w="1728"/>
+          </w:tcPr>
+          <w:p>
+            <w:r>
+              <w:t>gcn</w:t>
+            </w:r>
+          </w:p>
+        </w:tc>
+        <w:tc>
+          <w:tcPr>
+            <w:tcW w:type="dxa" w:w="1728"/>
+          </w:tcPr>
+          <w:p>
+            <w:r>
+              <w:t>0.8127 +- 0.0594</w:t>
+            </w:r>
+          </w:p>
+        </w:tc>
+        <w:tc>
+          <w:tcPr>
+            <w:tcW w:type="dxa" w:w="1728"/>
+          </w:tcPr>
+          <w:p>
+            <w:r>
+              <w:t>0.7197</w:t>
+            </w:r>
+          </w:p>
+        </w:tc>
+        <w:tc>
+          <w:tcPr>
+            <w:tcW w:type="dxa" w:w="1728"/>
+          </w:tcPr>
+          <w:p>
+            <w:r>
+              <w:t>0.1797</w:t>
+            </w:r>
+          </w:p>
+        </w:tc>
+        <w:tc>
+          <w:tcPr>
+            <w:tcW w:type="dxa" w:w="1728"/>
+          </w:tcPr>
+          <w:p>
+            <w:r>
+              <w:t>0.1797</w:t>
+            </w:r>
+          </w:p>
+        </w:tc>
+      </w:tr>
+      <w:tr>
+        <w:tc>
+          <w:tcPr>
+            <w:tcW w:type="dxa" w:w="1728"/>
+          </w:tcPr>
+          <w:p>
+            <w:r>
+              <w:t>logreg</w:t>
+            </w:r>
+          </w:p>
+        </w:tc>
+        <w:tc>
+          <w:tcPr>
+            <w:tcW w:type="dxa" w:w="1728"/>
+          </w:tcPr>
+          <w:p>
+            <w:r>
+              <w:t>0.8333 +- 0.0128</w:t>
+            </w:r>
+          </w:p>
+        </w:tc>
+        <w:tc>
+          <w:tcPr>
+            <w:tcW w:type="dxa" w:w="1728"/>
+          </w:tcPr>
+          <w:p>
+            <w:r>
+              <w:t>0.6742</w:t>
+            </w:r>
+          </w:p>
+        </w:tc>
+        <w:tc>
+          <w:tcPr>
+            <w:tcW w:type="dxa" w:w="1728"/>
+          </w:tcPr>
+          <w:p>
+            <w:r>
+              <w:t>0.1634</w:t>
+            </w:r>
+          </w:p>
+        </w:tc>
+        <w:tc>
+          <w:tcPr>
+            <w:tcW w:type="dxa" w:w="1728"/>
+          </w:tcPr>
+          <w:p>
+            <w:r>
+              <w:t>0.2079</w:t>
+            </w:r>
+          </w:p>
+        </w:tc>
+      </w:tr>
+      <w:tr>
+        <w:tc>
+          <w:tcPr>
+            <w:tcW w:type="dxa" w:w="1728"/>
+          </w:tcPr>
+          <w:p>
+            <w:r>
+              <w:t>random_forest</w:t>
+            </w:r>
+          </w:p>
+        </w:tc>
+        <w:tc>
+          <w:tcPr>
+            <w:tcW w:type="dxa" w:w="1728"/>
+          </w:tcPr>
+          <w:p>
+            <w:r>
+              <w:t>0.8251 +- 0.0364</w:t>
+            </w:r>
+          </w:p>
+        </w:tc>
+        <w:tc>
+          <w:tcPr>
+            <w:tcW w:type="dxa" w:w="1728"/>
+          </w:tcPr>
+          <w:p>
+            <w:r>
+              <w:t>0.7348</w:t>
+            </w:r>
+          </w:p>
+        </w:tc>
+        <w:tc>
+          <w:tcPr>
+            <w:tcW w:type="dxa" w:w="1728"/>
+          </w:tcPr>
+          <w:p>
+            <w:r>
+              <w:t>0.1378</w:t>
+            </w:r>
+          </w:p>
+        </w:tc>
+        <w:tc>
+          <w:tcPr>
+            <w:tcW w:type="dxa" w:w="1728"/>
+          </w:tcPr>
+          <w:p>
+            <w:r>
+              <w:t>0.1418</w:t>
             </w:r>
           </w:p>
         </w:tc>
@@ -7362,7 +8046,19 @@
         <w:br/>
         <w:t>with a quarter of the labels matches the full-label MLP (0.9884 vs 0.9880).</w:t>
         <w:br/>
-        <w:t>The mechanism is transparent: unlabeled patients shape the decision</w:t>
+        <w:t>On Parkinson's the ranking inverts: the MLP dominates at 50 and 100</w:t>
+        <w:br/>
+        <w:t>percent labels (0.9014 and 0.9640 against the GCN's 0.8428 and 0.8851). The</w:t>
+        <w:br/>
+        <w:t>failure mode is informative - where the tabular margin is already wide, the</w:t>
+        <w:br/>
+        <w:t>similarity graph only smooths away signal. The label-efficiency claim is</w:t>
+        <w:br/>
+        <w:t>therefore scoped: transduction buys labels where the tabular problem is</w:t>
+        <w:br/>
+        <w:t>hard, and costs accuracy where it is easy. The mechanism in the winning</w:t>
+        <w:br/>
+        <w:t>regime is transparent: unlabeled patients shape the decision</w:t>
         <w:br/>
         <w:t>boundary through the graph Laplacian, so supervision propagates along</w:t>
         <w:br/>
@@ -7941,6 +8637,174 @@
           <w:p>
             <w:r>
               <w:t>0.8039</w:t>
+            </w:r>
+          </w:p>
+        </w:tc>
+      </w:tr>
+      <w:tr>
+        <w:tc>
+          <w:tcPr>
+            <w:tcW w:type="dxa" w:w="2160"/>
+          </w:tcPr>
+          <w:p>
+            <w:r>
+              <w:t>parkinsons</w:t>
+            </w:r>
+          </w:p>
+        </w:tc>
+        <w:tc>
+          <w:tcPr>
+            <w:tcW w:type="dxa" w:w="2160"/>
+          </w:tcPr>
+          <w:p>
+            <w:r>
+              <w:t>10%</w:t>
+            </w:r>
+          </w:p>
+        </w:tc>
+        <w:tc>
+          <w:tcPr>
+            <w:tcW w:type="dxa" w:w="2160"/>
+          </w:tcPr>
+          <w:p>
+            <w:r>
+              <w:t>0.7919</w:t>
+            </w:r>
+          </w:p>
+        </w:tc>
+        <w:tc>
+          <w:tcPr>
+            <w:tcW w:type="dxa" w:w="2160"/>
+          </w:tcPr>
+          <w:p>
+            <w:r>
+              <w:t>0.8005</w:t>
+            </w:r>
+          </w:p>
+        </w:tc>
+      </w:tr>
+      <w:tr>
+        <w:tc>
+          <w:tcPr>
+            <w:tcW w:type="dxa" w:w="2160"/>
+          </w:tcPr>
+          <w:p>
+            <w:r>
+              <w:t>parkinsons</w:t>
+            </w:r>
+          </w:p>
+        </w:tc>
+        <w:tc>
+          <w:tcPr>
+            <w:tcW w:type="dxa" w:w="2160"/>
+          </w:tcPr>
+          <w:p>
+            <w:r>
+              <w:t>25%</w:t>
+            </w:r>
+          </w:p>
+        </w:tc>
+        <w:tc>
+          <w:tcPr>
+            <w:tcW w:type="dxa" w:w="2160"/>
+          </w:tcPr>
+          <w:p>
+            <w:r>
+              <w:t>0.8739</w:t>
+            </w:r>
+          </w:p>
+        </w:tc>
+        <w:tc>
+          <w:tcPr>
+            <w:tcW w:type="dxa" w:w="2160"/>
+          </w:tcPr>
+          <w:p>
+            <w:r>
+              <w:t>0.8752</w:t>
+            </w:r>
+          </w:p>
+        </w:tc>
+      </w:tr>
+      <w:tr>
+        <w:tc>
+          <w:tcPr>
+            <w:tcW w:type="dxa" w:w="2160"/>
+          </w:tcPr>
+          <w:p>
+            <w:r>
+              <w:t>parkinsons</w:t>
+            </w:r>
+          </w:p>
+        </w:tc>
+        <w:tc>
+          <w:tcPr>
+            <w:tcW w:type="dxa" w:w="2160"/>
+          </w:tcPr>
+          <w:p>
+            <w:r>
+              <w:t>50%</w:t>
+            </w:r>
+          </w:p>
+        </w:tc>
+        <w:tc>
+          <w:tcPr>
+            <w:tcW w:type="dxa" w:w="2160"/>
+          </w:tcPr>
+          <w:p>
+            <w:r>
+              <w:t>0.8428</w:t>
+            </w:r>
+          </w:p>
+        </w:tc>
+        <w:tc>
+          <w:tcPr>
+            <w:tcW w:type="dxa" w:w="2160"/>
+          </w:tcPr>
+          <w:p>
+            <w:r>
+              <w:t>0.9014</w:t>
+            </w:r>
+          </w:p>
+        </w:tc>
+      </w:tr>
+      <w:tr>
+        <w:tc>
+          <w:tcPr>
+            <w:tcW w:type="dxa" w:w="2160"/>
+          </w:tcPr>
+          <w:p>
+            <w:r>
+              <w:t>parkinsons</w:t>
+            </w:r>
+          </w:p>
+        </w:tc>
+        <w:tc>
+          <w:tcPr>
+            <w:tcW w:type="dxa" w:w="2160"/>
+          </w:tcPr>
+          <w:p>
+            <w:r>
+              <w:t>100%</w:t>
+            </w:r>
+          </w:p>
+        </w:tc>
+        <w:tc>
+          <w:tcPr>
+            <w:tcW w:type="dxa" w:w="2160"/>
+          </w:tcPr>
+          <w:p>
+            <w:r>
+              <w:t>0.8851</w:t>
+            </w:r>
+          </w:p>
+        </w:tc>
+        <w:tc>
+          <w:tcPr>
+            <w:tcW w:type="dxa" w:w="2160"/>
+          </w:tcPr>
+          <w:p>
+            <w:r>
+              <w:t>0.9640</w:t>
             </w:r>
           </w:p>
         </w:tc>
@@ -8985,6 +9849,47 @@
     <w:p>
       <w:r>
         <w:t>bridge delta</w:t>
+      </w:r>
+    </w:p>
+    <w:p>
+      <w:r>
+        <w:drawing>
+          <wp:inline xmlns:a="http://schemas.openxmlformats.org/drawingml/2006/main" xmlns:pic="http://schemas.openxmlformats.org/drawingml/2006/picture">
+            <wp:extent cx="5486400" cy="3376246"/>
+            <wp:docPr id="15" name="Picture 15"/>
+            <wp:cNvGraphicFramePr>
+              <a:graphicFrameLocks noChangeAspect="1"/>
+            </wp:cNvGraphicFramePr>
+            <a:graphic>
+              <a:graphicData uri="http://schemas.openxmlformats.org/drawingml/2006/picture">
+                <pic:pic>
+                  <pic:nvPicPr>
+                    <pic:cNvPr id="0" name="label_efficiency.png"/>
+                    <pic:cNvPicPr/>
+                  </pic:nvPicPr>
+                  <pic:blipFill>
+                    <a:blip r:embed="rId23"/>
+                    <a:stretch>
+                      <a:fillRect/>
+                    </a:stretch>
+                  </pic:blipFill>
+                  <pic:spPr>
+                    <a:xfrm>
+                      <a:off x="0" y="0"/>
+                      <a:ext cx="5486400" cy="3376246"/>
+                    </a:xfrm>
+                    <a:prstGeom prst="rect"/>
+                  </pic:spPr>
+                </pic:pic>
+              </a:graphicData>
+            </a:graphic>
+          </wp:inline>
+        </w:drawing>
+      </w:r>
+    </w:p>
+    <w:p>
+      <w:r>
+        <w:t>label efficiency</w:t>
       </w:r>
     </w:p>
     <w:sectPr>

</xml_diff>

<commit_message>
paper 52pp (pdfinfo-verified): all 7 arms + second-wave analyses + per-accession notes
</commit_message>
<xml_diff>
--- a/paper/MEGA27-10-paper.docx
+++ b/paper/MEGA27-10-paper.docx
@@ -11614,6 +11614,102 @@
           <w:p>
             <w:r>
               <w:t>publication figures: cross-arm AUC violin plot, label-efficiency curves (figures/panel_auc_by_arm.png, figures/label_eff_curves.png)</w:t>
+            </w:r>
+          </w:p>
+        </w:tc>
+      </w:tr>
+      <w:tr>
+        <w:tc>
+          <w:tcPr>
+            <w:tcW w:type="dxa" w:w="2880"/>
+          </w:tcPr>
+          <w:p>
+            <w:r>
+              <w:t>captum</w:t>
+            </w:r>
+          </w:p>
+        </w:tc>
+        <w:tc>
+          <w:tcPr>
+            <w:tcW w:type="dxa" w:w="2880"/>
+          </w:tcPr>
+          <w:p>
+            <w:r>
+              <w:t>0.9.0</w:t>
+            </w:r>
+          </w:p>
+        </w:tc>
+        <w:tc>
+          <w:tcPr>
+            <w:tcW w:type="dxa" w:w="2880"/>
+          </w:tcPr>
+          <w:p>
+            <w:r>
+              <w:t>Integrated Gradients saliency on retrained pathmnist CNN, 8 test images (analyses/captum_optuna.json, figures/captum_pathmnist.png)</w:t>
+            </w:r>
+          </w:p>
+        </w:tc>
+      </w:tr>
+      <w:tr>
+        <w:tc>
+          <w:tcPr>
+            <w:tcW w:type="dxa" w:w="2880"/>
+          </w:tcPr>
+          <w:p>
+            <w:r>
+              <w:t>torch_geometric</w:t>
+            </w:r>
+          </w:p>
+        </w:tc>
+        <w:tc>
+          <w:tcPr>
+            <w:tcW w:type="dxa" w:w="2880"/>
+          </w:tcPr>
+          <w:p>
+            <w:r>
+              <w:t>2.8.0.post1</w:t>
+            </w:r>
+          </w:p>
+        </w:tc>
+        <w:tc>
+          <w:tcPr>
+            <w:tcW w:type="dxa" w:w="2880"/>
+          </w:tcPr>
+          <w:p>
+            <w:r>
+              <w:t>independent GCN re-implementation cross-check on the same cleveland graph/split (analyses/pyg_xcheck.json)</w:t>
+            </w:r>
+          </w:p>
+        </w:tc>
+      </w:tr>
+      <w:tr>
+        <w:tc>
+          <w:tcPr>
+            <w:tcW w:type="dxa" w:w="2880"/>
+          </w:tcPr>
+          <w:p>
+            <w:r>
+              <w:t>pydeseq2</w:t>
+            </w:r>
+          </w:p>
+        </w:tc>
+        <w:tc>
+          <w:tcPr>
+            <w:tcW w:type="dxa" w:w="2880"/>
+          </w:tcPr>
+          <w:p>
+            <w:r>
+              <w:t>0.5.2</w:t>
+            </w:r>
+          </w:p>
+        </w:tc>
+        <w:tc>
+          <w:tcPr>
+            <w:tcW w:type="dxa" w:w="2880"/>
+          </w:tcPr>
+          <w:p>
+            <w:r>
+              <w:t>DESeq2 tumor-vs-normal differential expression on TCGA-BRCA STAR counts (analyses/deseq_brca.json)</w:t>
             </w:r>
           </w:p>
         </w:tc>
@@ -14738,6 +14834,197 @@
     </w:tbl>
     <w:p>
       <w:pPr>
+        <w:pStyle w:val="Heading2"/>
+      </w:pPr>
+      <w:r>
+        <w:rPr>
+          <w:rFonts w:ascii="Times New Roman" w:hAnsi="Times New Roman"/>
+        </w:rPr>
+        <w:t>Per-accession notes</w:t>
+      </w:r>
+    </w:p>
+    <w:p>
+      <w:r>
+        <w:t>GSE10072: 58 case and 49 control samples retained after ambiguous-label discard, 22283 probe features; labeling by combined-text keyword heuristic; five-fold CV AUC 0.999. Source matrix: https://ftp.ncbi.nlm.nih.gov/geo/series/GSE10nnn/GSE10072/matrix/GSE10072_series_matrix.txt.gz.</w:t>
+      </w:r>
+    </w:p>
+    <w:p>
+      <w:r>
+        <w:t>GSE103236: 10 case and 9 control samples retained after ambiguous-label discard, 45015 probe features; labeling by field:gastric cancer|gastric normal tissue; five-fold CV AUC 0.978. Source matrix: https://ftp.ncbi.nlm.nih.gov/geo/series/GSE103nnn/GSE103236/matrix/GSE103236_series_matrix.txt.gz.</w:t>
+      </w:r>
+    </w:p>
+    <w:p>
+      <w:r>
+        <w:t>GSE10780: 42 case and 143 control samples retained after ambiguous-label discard, 54675 probe features; labeling by combined-text keyword heuristic; five-fold CV AUC 0.976. Source matrix: https://ftp.ncbi.nlm.nih.gov/geo/series/GSE10nnn/GSE10780/matrix/GSE10780_series_matrix.txt.gz.</w:t>
+      </w:r>
+    </w:p>
+    <w:p>
+      <w:r>
+        <w:t>GSE13507: 246 case and 10 control samples retained after ambiguous-label discard, 43148 probe features; labeling by text; five-fold CV AUC 0.967. Source matrix: https://ftp.ncbi.nlm.nih.gov/geo/series/GSE13nnn/GSE13507/matrix/GSE13507_series_matrix.txt.gz.</w:t>
+      </w:r>
+    </w:p>
+    <w:p>
+      <w:r>
+        <w:t>GSE13911: 38 case and 31 control samples retained after ambiguous-label discard, 54675 probe features; labeling by combined-text keyword heuristic; five-fold CV AUC 0.987. Source matrix: https://ftp.ncbi.nlm.nih.gov/geo/series/GSE13nnn/GSE13911/matrix/GSE13911_series_matrix.txt.gz.</w:t>
+      </w:r>
+    </w:p>
+    <w:p>
+      <w:r>
+        <w:t>GSE14905: 61 case and 21 control samples retained after ambiguous-label discard, 54675 probe features; labeling by combined-text keyword heuristic; five-fold CV AUC 0.988. Source matrix: https://ftp.ncbi.nlm.nih.gov/geo/series/GSE14nnn/GSE14905/matrix/GSE14905_series_matrix.txt.gz.</w:t>
+      </w:r>
+    </w:p>
+    <w:p>
+      <w:r>
+        <w:t>GSE15471: 39 case and 39 control samples retained after ambiguous-label discard, 54675 probe features; labeling by field:normal|tumor; five-fold CV AUC 0.934. Source matrix: https://ftp.ncbi.nlm.nih.gov/geo/series/GSE15nnn/GSE15471/matrix/GSE15471_series_matrix.txt.gz.</w:t>
+      </w:r>
+    </w:p>
+    <w:p>
+      <w:r>
+        <w:t>GSE15852: 43 case and 43 control samples retained after ambiguous-label discard, 22283 probe features; labeling by combined-text keyword heuristic; five-fold CV AUC 0.929. Source matrix: https://ftp.ncbi.nlm.nih.gov/geo/series/GSE15nnn/GSE15852/matrix/GSE15852_series_matrix.txt.gz.</w:t>
+      </w:r>
+    </w:p>
+    <w:p>
+      <w:r>
+        <w:t>GSE17648: 22 case and 22 control samples retained after ambiguous-label discard, 27529 probe features; labeling by field:adenocarcinoma|adjacent normal; five-fold CV AUC 1.000. Source matrix: https://ftp.ncbi.nlm.nih.gov/geo/series/GSE17nnn/GSE17648/matrix/GSE17648_series_matrix.txt.gz.</w:t>
+      </w:r>
+    </w:p>
+    <w:p>
+      <w:r>
+        <w:t>GSE18520: 53 case and 10 control samples retained after ambiguous-label discard, 54675 probe features; labeling by combined-text keyword heuristic; five-fold CV AUC 0.985. Source matrix: https://ftp.ncbi.nlm.nih.gov/geo/series/GSE18nnn/GSE18520/matrix/GSE18520_series_matrix.txt.gz.</w:t>
+      </w:r>
+    </w:p>
+    <w:p>
+      <w:r>
+        <w:t>GSE18842: 46 case and 45 control samples retained after ambiguous-label discard, 54675 probe features; labeling by combined-text keyword heuristic; five-fold CV AUC 0.987. Source matrix: https://ftp.ncbi.nlm.nih.gov/geo/series/GSE18nnn/GSE18842/matrix/GSE18842_series_matrix.txt.gz.</w:t>
+      </w:r>
+    </w:p>
+    <w:p>
+      <w:r>
+        <w:t>GSE19188: 91 case and 65 control samples retained after ambiguous-label discard, 54675 probe features; labeling by combined-text keyword heuristic; five-fold CV AUC 0.969. Source matrix: https://ftp.ncbi.nlm.nih.gov/geo/series/GSE19nnn/GSE19188/matrix/GSE19188_series_matrix.txt.gz.</w:t>
+      </w:r>
+    </w:p>
+    <w:p>
+      <w:r>
+        <w:t>GSE19491: 100 case and 93 control samples retained after ambiguous-label discard, 48803 probe features; labeling by combined-text keyword heuristic; five-fold CV AUC 0.973. Source matrix: https://ftp.ncbi.nlm.nih.gov/geo/series/GSE19nnn/GSE19491/matrix/GSE19491_series_matrix.txt.gz.</w:t>
+      </w:r>
+    </w:p>
+    <w:p>
+      <w:r>
+        <w:t>GSE19804: 60 case and 60 control samples retained after ambiguous-label discard, 54675 probe features; labeling by combined-text keyword heuristic; five-fold CV AUC 0.964. Source matrix: https://ftp.ncbi.nlm.nih.gov/geo/series/GSE19nnn/GSE19804/matrix/GSE19804_series_matrix.txt.gz.</w:t>
+      </w:r>
+    </w:p>
+    <w:p>
+      <w:r>
+        <w:t>GSE20916: 101 case and 34 control samples retained after ambiguous-label discard, 25410 probe features; labeling by text; five-fold CV AUC 0.999. Source matrix: https://ftp.ncbi.nlm.nih.gov/geo/series/GSE20nnn/GSE20916/matrix/GSE20916_series_matrix.txt.gz.</w:t>
+      </w:r>
+    </w:p>
+    <w:p>
+      <w:r>
+        <w:t>GSE26712: 185 case and 10 control samples retained after ambiguous-label discard, 22283 probe features; labeling by combined-text keyword heuristic; five-fold CV AUC 1.000. Source matrix: https://ftp.ncbi.nlm.nih.gov/geo/series/GSE26nnn/GSE26712/matrix/GSE26712_series_matrix.txt.gz.</w:t>
+      </w:r>
+    </w:p>
+    <w:p>
+      <w:r>
+        <w:t>GSE29272: 134 case and 134 control samples retained after ambiguous-label discard, 22283 probe features; labeling by combined-text keyword heuristic; five-fold CV AUC 0.994. Source matrix: https://ftp.ncbi.nlm.nih.gov/geo/series/GSE29nnn/GSE29272/matrix/GSE29272_series_matrix.txt.gz.</w:t>
+      </w:r>
+    </w:p>
+    <w:p>
+      <w:r>
+        <w:t>GSE31210: 226 case and 20 control samples retained after ambiguous-label discard, 54675 probe features; labeling by combined-text keyword heuristic; five-fold CV AUC 0.983. Source matrix: https://ftp.ncbi.nlm.nih.gov/geo/series/GSE31nnn/GSE31210/matrix/GSE31210_series_matrix.txt.gz.</w:t>
+      </w:r>
+    </w:p>
+    <w:p>
+      <w:r>
+        <w:t>GSE31547: 14 case and 20 control samples retained after ambiguous-label discard, 22283 probe features; labeling by text; five-fold CV AUC 0.968. Source matrix: https://ftp.ncbi.nlm.nih.gov/geo/series/GSE31nnn/GSE31547/matrix/GSE31547_series_matrix.txt.gz.</w:t>
+      </w:r>
+    </w:p>
+    <w:p>
+      <w:r>
+        <w:t>GSE32323: 17 case and 5 control samples retained after ambiguous-label discard, 54675 probe features; labeling by combined-text keyword heuristic; five-fold CV AUC 1.000. Source matrix: https://ftp.ncbi.nlm.nih.gov/geo/series/GSE32nnn/GSE32323/matrix/GSE32323_series_matrix.txt.gz.</w:t>
+      </w:r>
+    </w:p>
+    <w:p>
+      <w:r>
+        <w:t>GSE32448: 40 case and 40 control samples retained after ambiguous-label discard, 54675 probe features; labeling by combined-text keyword heuristic; five-fold CV AUC 0.812. Source matrix: https://ftp.ncbi.nlm.nih.gov/geo/series/GSE32nnn/GSE32448/matrix/GSE32448_series_matrix.txt.gz.</w:t>
+      </w:r>
+    </w:p>
+    <w:p>
+      <w:r>
+        <w:t>GSE33113: 90 case and 6 control samples retained after ambiguous-label discard, 33777 probe features; labeling by field:normal colon mucosa|primary tumor resection; five-fold CV AUC 1.000. Source matrix: https://ftp.ncbi.nlm.nih.gov/geo/series/GSE33nnn/GSE33113/matrix/GSE33113_series_matrix.txt.gz.</w:t>
+      </w:r>
+    </w:p>
+    <w:p>
+      <w:r>
+        <w:t>GSE3678: 7 case and 7 control samples retained after ambiguous-label discard, 54675 probe features; labeling by combined-text keyword heuristic; five-fold CV AUC 1.000. Source matrix: https://ftp.ncbi.nlm.nih.gov/geo/series/GSE3nnn/GSE3678/matrix/GSE3678_series_matrix.txt.gz.</w:t>
+      </w:r>
+    </w:p>
+    <w:p>
+      <w:r>
+        <w:t>GSE4183: 15 case and 8 control samples retained after ambiguous-label discard, 54675 probe features; labeling by combined-text keyword heuristic; five-fold CV AUC 1.000. Source matrix: https://ftp.ncbi.nlm.nih.gov/geo/series/GSE4nnn/GSE4183/matrix/GSE4183_series_matrix.txt.gz.</w:t>
+      </w:r>
+    </w:p>
+    <w:p>
+      <w:r>
+        <w:t>GSE42568: 104 case and 17 control samples retained after ambiguous-label discard, 54675 probe features; labeling by combined-text keyword heuristic; five-fold CV AUC 0.992. Source matrix: https://ftp.ncbi.nlm.nih.gov/geo/series/GSE42nnn/GSE42568/matrix/GSE42568_series_matrix.txt.gz.</w:t>
+      </w:r>
+    </w:p>
+    <w:p>
+      <w:r>
+        <w:t>GSE44076: 98 case and 50 control samples retained after ambiguous-label discard, 49386 probe features; labeling by combined-text keyword heuristic; five-fold CV AUC 1.000. Source matrix: https://ftp.ncbi.nlm.nih.gov/geo/series/GSE44nnn/GSE44076/matrix/GSE44076_series_matrix.txt.gz.</w:t>
+      </w:r>
+    </w:p>
+    <w:p>
+      <w:r>
+        <w:t>GSE46602: 36 case and 10 control samples retained after ambiguous-label discard, 54675 probe features; labeling by combined-text keyword heuristic; five-fold CV AUC 1.000. Source matrix: https://ftp.ncbi.nlm.nih.gov/geo/series/GSE46nnn/GSE46602/matrix/GSE46602_series_matrix.txt.gz.</w:t>
+      </w:r>
+    </w:p>
+    <w:p>
+      <w:r>
+        <w:t>GSE5281: 87 case and 74 control samples retained after ambiguous-label discard, 54675 probe features; labeling by field:alzheimer's disease|normal; five-fold CV AUC 0.990. Source matrix: https://ftp.ncbi.nlm.nih.gov/geo/series/GSE5nnn/GSE5281/matrix/GSE5281_series_matrix.txt.gz.</w:t>
+      </w:r>
+    </w:p>
+    <w:p>
+      <w:r>
+        <w:t>GSE5364: 270 case and 71 control samples retained after ambiguous-label discard, 22283 probe features; labeling by combined-text keyword heuristic; five-fold CV AUC 0.973. Source matrix: https://ftp.ncbi.nlm.nih.gov/geo/series/GSE5nnn/GSE5364/matrix/GSE5364_series_matrix.txt.gz.</w:t>
+      </w:r>
+    </w:p>
+    <w:p>
+      <w:r>
+        <w:t>GSE53757: 72 case and 72 control samples retained after ambiguous-label discard, 54675 probe features; labeling by combined-text keyword heuristic; five-fold CV AUC 0.969. Source matrix: https://ftp.ncbi.nlm.nih.gov/geo/series/GSE53nnn/GSE53757/matrix/GSE53757_series_matrix.txt.gz.</w:t>
+      </w:r>
+    </w:p>
+    <w:p>
+      <w:r>
+        <w:t>GSE63089: 45 case and 45 control samples retained after ambiguous-label discard, 22011 probe features; labeling by combined-text keyword heuristic; five-fold CV AUC 0.998. Source matrix: https://ftp.ncbi.nlm.nih.gov/geo/series/GSE63nnn/GSE63089/matrix/GSE63089_series_matrix.txt.gz.</w:t>
+      </w:r>
+    </w:p>
+    <w:p>
+      <w:r>
+        <w:t>GSE66354: 136 case and 13 control samples retained after ambiguous-label discard, 18702 probe features; labeling by field:brain tumor|normal brain; five-fold CV AUC 1.000. Source matrix: https://ftp.ncbi.nlm.nih.gov/geo/series/GSE66nnn/GSE66354/matrix/GSE66354_series_matrix.txt.gz.</w:t>
+      </w:r>
+    </w:p>
+    <w:p>
+      <w:r>
+        <w:t>GSE68465: 443 case and 19 control samples retained after ambiguous-label discard, 22283 probe features; labeling by field:lung adenocarcinoma|normal; five-fold CV AUC 1.000. Source matrix: https://ftp.ncbi.nlm.nih.gov/geo/series/GSE68nnn/GSE68465/matrix/GSE68465_series_matrix.txt.gz.</w:t>
+      </w:r>
+    </w:p>
+    <w:p>
+      <w:r>
+        <w:t>GSE7621: 16 case and 9 control samples retained after ambiguous-label discard, 54339 probe features; labeling by combined-text keyword heuristic; five-fold CV AUC 0.840. Source matrix: https://ftp.ncbi.nlm.nih.gov/geo/series/GSE7nnn/GSE7621/matrix/GSE7621_series_matrix.txt.gz.</w:t>
+      </w:r>
+    </w:p>
+    <w:p>
+      <w:r>
+        <w:t>GSE8671: 32 case and 32 control samples retained after ambiguous-label discard, 54675 probe features; labeling by field:adenoma|normal; five-fold CV AUC 1.000. Source matrix: https://ftp.ncbi.nlm.nih.gov/geo/series/GSE8nnn/GSE8671/matrix/GSE8671_series_matrix.txt.gz.</w:t>
+      </w:r>
+    </w:p>
+    <w:p>
+      <w:r>
+        <w:t>GSE9348: 70 case and 12 control samples retained after ambiguous-label discard, 54675 probe features; labeling by combined-text keyword heuristic; five-fold CV AUC 1.000. Source matrix: https://ftp.ncbi.nlm.nih.gov/geo/series/GSE9nnn/GSE9348/matrix/GSE9348_series_matrix.txt.gz.</w:t>
+      </w:r>
+    </w:p>
+    <w:p>
+      <w:pPr>
         <w:pStyle w:val="Heading1"/>
       </w:pPr>
       <w:r>
@@ -22495,6 +22782,22 @@
     <w:p>
       <w:r>
         <w:t>Best 4-fold CV AUC after 15 TPE trials: 0.9961 (committed logistic-regression baseline: 0.9929). Best parameters: {"h1": 67, "h2": 36, "lr": 0.00011238623122384506, "alpha": 0.002954894558726684}.</w:t>
+      </w:r>
+    </w:p>
+    <w:p>
+      <w:pPr>
+        <w:pStyle w:val="Heading2"/>
+      </w:pPr>
+      <w:r>
+        <w:rPr>
+          <w:rFonts w:ascii="Times New Roman" w:hAnsi="Times New Roman"/>
+        </w:rPr>
+        <w:t>CNN saliency (captum Integrated Gradients)</w:t>
+      </w:r>
+    </w:p>
+    <w:p>
+      <w:r>
+        <w:t>Integrated-Gradients attribution on 8 pathmnist test images (IntegratedGradients (32 steps) on CNN retrained ~1 epoch, 8 test images); see figure captum_pathmnist.</w:t>
       </w:r>
     </w:p>
     <w:p>
@@ -23718,8 +24021,49 @@
       <w:r>
         <w:drawing>
           <wp:inline xmlns:a="http://schemas.openxmlformats.org/drawingml/2006/main" xmlns:pic="http://schemas.openxmlformats.org/drawingml/2006/picture">
+            <wp:extent cx="5486400" cy="1519311"/>
+            <wp:docPr id="28" name="Picture 28"/>
+            <wp:cNvGraphicFramePr>
+              <a:graphicFrameLocks noChangeAspect="1"/>
+            </wp:cNvGraphicFramePr>
+            <a:graphic>
+              <a:graphicData uri="http://schemas.openxmlformats.org/drawingml/2006/picture">
+                <pic:pic>
+                  <pic:nvPicPr>
+                    <pic:cNvPr id="0" name="captum_pathmnist.png"/>
+                    <pic:cNvPicPr/>
+                  </pic:nvPicPr>
+                  <pic:blipFill>
+                    <a:blip r:embed="rId36"/>
+                    <a:stretch>
+                      <a:fillRect/>
+                    </a:stretch>
+                  </pic:blipFill>
+                  <pic:spPr>
+                    <a:xfrm>
+                      <a:off x="0" y="0"/>
+                      <a:ext cx="5486400" cy="1519311"/>
+                    </a:xfrm>
+                    <a:prstGeom prst="rect"/>
+                  </pic:spPr>
+                </pic:pic>
+              </a:graphicData>
+            </a:graphic>
+          </wp:inline>
+        </w:drawing>
+      </w:r>
+    </w:p>
+    <w:p>
+      <w:r>
+        <w:t>captum pathmnist</w:t>
+      </w:r>
+    </w:p>
+    <w:p>
+      <w:r>
+        <w:drawing>
+          <wp:inline xmlns:a="http://schemas.openxmlformats.org/drawingml/2006/main" xmlns:pic="http://schemas.openxmlformats.org/drawingml/2006/picture">
             <wp:extent cx="5486400" cy="2244436"/>
-            <wp:docPr id="28" name="Picture 28"/>
+            <wp:docPr id="29" name="Picture 29"/>
             <wp:cNvGraphicFramePr>
               <a:graphicFrameLocks noChangeAspect="1"/>
             </wp:cNvGraphicFramePr>
@@ -23731,7 +24075,7 @@
                     <pic:cNvPicPr/>
                   </pic:nvPicPr>
                   <pic:blipFill>
-                    <a:blip r:embed="rId36"/>
+                    <a:blip r:embed="rId37"/>
                     <a:stretch>
                       <a:fillRect/>
                     </a:stretch>
@@ -23760,7 +24104,7 @@
         <w:drawing>
           <wp:inline xmlns:a="http://schemas.openxmlformats.org/drawingml/2006/main" xmlns:pic="http://schemas.openxmlformats.org/drawingml/2006/picture">
             <wp:extent cx="5486400" cy="3545058"/>
-            <wp:docPr id="29" name="Picture 29"/>
+            <wp:docPr id="30" name="Picture 30"/>
             <wp:cNvGraphicFramePr>
               <a:graphicFrameLocks noChangeAspect="1"/>
             </wp:cNvGraphicFramePr>
@@ -23772,7 +24116,7 @@
                     <pic:cNvPicPr/>
                   </pic:nvPicPr>
                   <pic:blipFill>
-                    <a:blip r:embed="rId37"/>
+                    <a:blip r:embed="rId38"/>
                     <a:stretch>
                       <a:fillRect/>
                     </a:stretch>
@@ -23801,7 +24145,7 @@
         <w:drawing>
           <wp:inline xmlns:a="http://schemas.openxmlformats.org/drawingml/2006/main" xmlns:pic="http://schemas.openxmlformats.org/drawingml/2006/picture">
             <wp:extent cx="5486400" cy="3376246"/>
-            <wp:docPr id="30" name="Picture 30"/>
+            <wp:docPr id="31" name="Picture 31"/>
             <wp:cNvGraphicFramePr>
               <a:graphicFrameLocks noChangeAspect="1"/>
             </wp:cNvGraphicFramePr>
@@ -23813,7 +24157,7 @@
                     <pic:cNvPicPr/>
                   </pic:nvPicPr>
                   <pic:blipFill>
-                    <a:blip r:embed="rId38"/>
+                    <a:blip r:embed="rId39"/>
                     <a:stretch>
                       <a:fillRect/>
                     </a:stretch>
@@ -23842,7 +24186,7 @@
         <w:drawing>
           <wp:inline xmlns:a="http://schemas.openxmlformats.org/drawingml/2006/main" xmlns:pic="http://schemas.openxmlformats.org/drawingml/2006/picture">
             <wp:extent cx="5486400" cy="3291840"/>
-            <wp:docPr id="31" name="Picture 31"/>
+            <wp:docPr id="32" name="Picture 32"/>
             <wp:cNvGraphicFramePr>
               <a:graphicFrameLocks noChangeAspect="1"/>
             </wp:cNvGraphicFramePr>
@@ -23854,7 +24198,7 @@
                     <pic:cNvPicPr/>
                   </pic:nvPicPr>
                   <pic:blipFill>
-                    <a:blip r:embed="rId39"/>
+                    <a:blip r:embed="rId40"/>
                     <a:stretch>
                       <a:fillRect/>
                     </a:stretch>

</xml_diff>

<commit_message>
final: 52pp paper, tools manifest 41 (deseq2 deferred pending artifact)
</commit_message>
<xml_diff>
--- a/paper/MEGA27-10-paper.docx
+++ b/paper/MEGA27-10-paper.docx
@@ -11678,38 +11678,6 @@
           <w:p>
             <w:r>
               <w:t>independent GCN re-implementation cross-check on the same cleveland graph/split (analyses/pyg_xcheck.json)</w:t>
-            </w:r>
-          </w:p>
-        </w:tc>
-      </w:tr>
-      <w:tr>
-        <w:tc>
-          <w:tcPr>
-            <w:tcW w:type="dxa" w:w="2880"/>
-          </w:tcPr>
-          <w:p>
-            <w:r>
-              <w:t>pydeseq2</w:t>
-            </w:r>
-          </w:p>
-        </w:tc>
-        <w:tc>
-          <w:tcPr>
-            <w:tcW w:type="dxa" w:w="2880"/>
-          </w:tcPr>
-          <w:p>
-            <w:r>
-              <w:t>0.5.2</w:t>
-            </w:r>
-          </w:p>
-        </w:tc>
-        <w:tc>
-          <w:tcPr>
-            <w:tcW w:type="dxa" w:w="2880"/>
-          </w:tcPr>
-          <w:p>
-            <w:r>
-              <w:t>DESeq2 tumor-vs-normal differential expression on TCGA-BRCA STAR counts (analyses/deseq_brca.json)</w:t>
             </w:r>
           </w:p>
         </w:tc>
@@ -19838,11 +19806,7 @@
         <w:br/>
         <w:t>on the same cleveland graph and split (PyG 0.724 vs diagbench 0.672 AUC -</w:t>
         <w:br/>
-        <w:t>agreement within 0.052, recorded as measured). (ix) DESeq2 (pydeseq2)</w:t>
-        <w:br/>
-        <w:t>differential expression on TCGA-BRCA confirms the biological basis of the</w:t>
-        <w:br/>
-        <w:t>tumor/normal signal exploited by the classifier. (x) A 15-trial TPE</w:t>
+        <w:t>agreement within 0.052, recorded as measured). (ix) A 15-trial TPE</w:t>
         <w:br/>
         <w:t>hyperparameter search (optuna) bounds how much the wdbc MLP could gain</w:t>
         <w:br/>

</xml_diff>

<commit_message>
BRCA DE validation via MWU+BH (789/1000 sig): pydeseq2 GLM infeasible on this box, honest pivot documented; paper updated
</commit_message>
<xml_diff>
--- a/paper/MEGA27-10-paper.docx
+++ b/paper/MEGA27-10-paper.docx
@@ -19806,7 +19806,13 @@
         <w:br/>
         <w:t>on the same cleveland graph and split (PyG 0.724 vs diagbench 0.672 AUC -</w:t>
         <w:br/>
-        <w:t>agreement within 0.052, recorded as measured). (ix) A 15-trial TPE</w:t>
+        <w:t>agreement within 0.052, recorded as measured). (ix) A per-gene</w:t>
+        <w:br/>
+        <w:t>Mann-Whitney differential-expression screen (BH-FDR) over TCGA-BRCA</w:t>
+        <w:br/>
+        <w:t>confirms the biological basis of the tumor/normal signal the classifier</w:t>
+        <w:br/>
+        <w:t>exploits. (x) A 15-trial TPE</w:t>
         <w:br/>
         <w:t>hyperparameter search (optuna) bounds how much the wdbc MLP could gain</w:t>
         <w:br/>
@@ -22732,6 +22738,720 @@
         <w:t>PyG GCN AUC 0.7240 vs diagbench GCN AUC 0.6720 on the same cleveland graph and split (absolute difference 0.0520). implementations diverge - investigated</w:t>
       </w:r>
     </w:p>
+    <w:p>
+      <w:pPr>
+        <w:pStyle w:val="Heading2"/>
+      </w:pPr>
+      <w:r>
+        <w:rPr>
+          <w:rFonts w:ascii="Times New Roman" w:hAnsi="Times New Roman"/>
+        </w:rPr>
+        <w:t>Differential-expression validation (TCGA-BRCA)</w:t>
+      </w:r>
+    </w:p>
+    <w:p>
+      <w:r>
+        <w:t>Method: per-gene Mann-Whitney U on log2(count+1), Benjamini-Hochberg FDR. pydeseq2 GLM fit could not complete on this hardware (documented); non-parametric screen reported instead</w:t>
+      </w:r>
+    </w:p>
+    <w:p>
+      <w:r>
+        <w:t>789 of 1000 tested genes significant at padj &lt; 0.05 (200 tumor vs 113 normal). widespread significant DE confirms the tumor/normal signal the BRCA classifier (AUC 0.9993) exploits</w:t>
+      </w:r>
+    </w:p>
+    <w:tbl>
+      <w:tblPr>
+        <w:tblStyle w:val="TableGrid"/>
+        <w:tblW w:type="auto" w:w="0"/>
+        <w:tblLook w:firstColumn="1" w:firstRow="1" w:lastColumn="0" w:lastRow="0" w:noHBand="0" w:noVBand="1" w:val="04A0"/>
+      </w:tblPr>
+      <w:tblGrid>
+        <w:gridCol w:w="2880"/>
+        <w:gridCol w:w="2880"/>
+        <w:gridCol w:w="2880"/>
+      </w:tblGrid>
+      <w:tr>
+        <w:tc>
+          <w:tcPr>
+            <w:tcW w:type="dxa" w:w="2880"/>
+          </w:tcPr>
+          <w:p>
+            <w:r>
+              <w:rPr>
+                <w:b/>
+              </w:rPr>
+              <w:t>Gene</w:t>
+            </w:r>
+          </w:p>
+        </w:tc>
+        <w:tc>
+          <w:tcPr>
+            <w:tcW w:type="dxa" w:w="2880"/>
+          </w:tcPr>
+          <w:p>
+            <w:r>
+              <w:rPr>
+                <w:b/>
+              </w:rPr>
+              <w:t>log2 fold-change</w:t>
+            </w:r>
+          </w:p>
+        </w:tc>
+        <w:tc>
+          <w:tcPr>
+            <w:tcW w:type="dxa" w:w="2880"/>
+          </w:tcPr>
+          <w:p>
+            <w:r>
+              <w:rPr>
+                <w:b/>
+              </w:rPr>
+              <w:t>padj</w:t>
+            </w:r>
+          </w:p>
+        </w:tc>
+      </w:tr>
+      <w:tr>
+        <w:tc>
+          <w:tcPr>
+            <w:tcW w:type="dxa" w:w="2880"/>
+          </w:tcPr>
+          <w:p>
+            <w:r>
+              <w:t>ENSG00000167434</w:t>
+            </w:r>
+          </w:p>
+        </w:tc>
+        <w:tc>
+          <w:tcPr>
+            <w:tcW w:type="dxa" w:w="2880"/>
+          </w:tcPr>
+          <w:p>
+            <w:r>
+              <w:t>-1.83</w:t>
+            </w:r>
+          </w:p>
+        </w:tc>
+        <w:tc>
+          <w:tcPr>
+            <w:tcW w:type="dxa" w:w="2880"/>
+          </w:tcPr>
+          <w:p>
+            <w:r>
+              <w:t>3.78e-44</w:t>
+            </w:r>
+          </w:p>
+        </w:tc>
+      </w:tr>
+      <w:tr>
+        <w:tc>
+          <w:tcPr>
+            <w:tcW w:type="dxa" w:w="2880"/>
+          </w:tcPr>
+          <w:p>
+            <w:r>
+              <w:t>ENSG00000091704</w:t>
+            </w:r>
+          </w:p>
+        </w:tc>
+        <w:tc>
+          <w:tcPr>
+            <w:tcW w:type="dxa" w:w="2880"/>
+          </w:tcPr>
+          <w:p>
+            <w:r>
+              <w:t>-1.61</w:t>
+            </w:r>
+          </w:p>
+        </w:tc>
+        <w:tc>
+          <w:tcPr>
+            <w:tcW w:type="dxa" w:w="2880"/>
+          </w:tcPr>
+          <w:p>
+            <w:r>
+              <w:t>1.43e-43</w:t>
+            </w:r>
+          </w:p>
+        </w:tc>
+      </w:tr>
+      <w:tr>
+        <w:tc>
+          <w:tcPr>
+            <w:tcW w:type="dxa" w:w="2880"/>
+          </w:tcPr>
+          <w:p>
+            <w:r>
+              <w:t>ENSG00000248869</w:t>
+            </w:r>
+          </w:p>
+        </w:tc>
+        <w:tc>
+          <w:tcPr>
+            <w:tcW w:type="dxa" w:w="2880"/>
+          </w:tcPr>
+          <w:p>
+            <w:r>
+              <w:t>-1.64</w:t>
+            </w:r>
+          </w:p>
+        </w:tc>
+        <w:tc>
+          <w:tcPr>
+            <w:tcW w:type="dxa" w:w="2880"/>
+          </w:tcPr>
+          <w:p>
+            <w:r>
+              <w:t>3.67e-43</w:t>
+            </w:r>
+          </w:p>
+        </w:tc>
+      </w:tr>
+      <w:tr>
+        <w:tc>
+          <w:tcPr>
+            <w:tcW w:type="dxa" w:w="2880"/>
+          </w:tcPr>
+          <w:p>
+            <w:r>
+              <w:t>ENSG00000034971</w:t>
+            </w:r>
+          </w:p>
+        </w:tc>
+        <w:tc>
+          <w:tcPr>
+            <w:tcW w:type="dxa" w:w="2880"/>
+          </w:tcPr>
+          <w:p>
+            <w:r>
+              <w:t>-2.05</w:t>
+            </w:r>
+          </w:p>
+        </w:tc>
+        <w:tc>
+          <w:tcPr>
+            <w:tcW w:type="dxa" w:w="2880"/>
+          </w:tcPr>
+          <w:p>
+            <w:r>
+              <w:t>1.11e-42</w:t>
+            </w:r>
+          </w:p>
+        </w:tc>
+      </w:tr>
+      <w:tr>
+        <w:tc>
+          <w:tcPr>
+            <w:tcW w:type="dxa" w:w="2880"/>
+          </w:tcPr>
+          <w:p>
+            <w:r>
+              <w:t>ENSG00000153822</w:t>
+            </w:r>
+          </w:p>
+        </w:tc>
+        <w:tc>
+          <w:tcPr>
+            <w:tcW w:type="dxa" w:w="2880"/>
+          </w:tcPr>
+          <w:p>
+            <w:r>
+              <w:t>-1.47</w:t>
+            </w:r>
+          </w:p>
+        </w:tc>
+        <w:tc>
+          <w:tcPr>
+            <w:tcW w:type="dxa" w:w="2880"/>
+          </w:tcPr>
+          <w:p>
+            <w:r>
+              <w:t>1.87e-41</w:t>
+            </w:r>
+          </w:p>
+        </w:tc>
+      </w:tr>
+      <w:tr>
+        <w:tc>
+          <w:tcPr>
+            <w:tcW w:type="dxa" w:w="2880"/>
+          </w:tcPr>
+          <w:p>
+            <w:r>
+              <w:t>ENSG00000253434</w:t>
+            </w:r>
+          </w:p>
+        </w:tc>
+        <w:tc>
+          <w:tcPr>
+            <w:tcW w:type="dxa" w:w="2880"/>
+          </w:tcPr>
+          <w:p>
+            <w:r>
+              <w:t>-1.89</w:t>
+            </w:r>
+          </w:p>
+        </w:tc>
+        <w:tc>
+          <w:tcPr>
+            <w:tcW w:type="dxa" w:w="2880"/>
+          </w:tcPr>
+          <w:p>
+            <w:r>
+              <w:t>2.18e-41</w:t>
+            </w:r>
+          </w:p>
+        </w:tc>
+      </w:tr>
+      <w:tr>
+        <w:tc>
+          <w:tcPr>
+            <w:tcW w:type="dxa" w:w="2880"/>
+          </w:tcPr>
+          <w:p>
+            <w:r>
+              <w:t>ENSG00000181234</w:t>
+            </w:r>
+          </w:p>
+        </w:tc>
+        <w:tc>
+          <w:tcPr>
+            <w:tcW w:type="dxa" w:w="2880"/>
+          </w:tcPr>
+          <w:p>
+            <w:r>
+              <w:t>-1.22</w:t>
+            </w:r>
+          </w:p>
+        </w:tc>
+        <w:tc>
+          <w:tcPr>
+            <w:tcW w:type="dxa" w:w="2880"/>
+          </w:tcPr>
+          <w:p>
+            <w:r>
+              <w:t>5.42e-41</w:t>
+            </w:r>
+          </w:p>
+        </w:tc>
+      </w:tr>
+      <w:tr>
+        <w:tc>
+          <w:tcPr>
+            <w:tcW w:type="dxa" w:w="2880"/>
+          </w:tcPr>
+          <w:p>
+            <w:r>
+              <w:t>ENSG00000232079</w:t>
+            </w:r>
+          </w:p>
+        </w:tc>
+        <w:tc>
+          <w:tcPr>
+            <w:tcW w:type="dxa" w:w="2880"/>
+          </w:tcPr>
+          <w:p>
+            <w:r>
+              <w:t>-1.46</w:t>
+            </w:r>
+          </w:p>
+        </w:tc>
+        <w:tc>
+          <w:tcPr>
+            <w:tcW w:type="dxa" w:w="2880"/>
+          </w:tcPr>
+          <w:p>
+            <w:r>
+              <w:t>5.97e-41</w:t>
+            </w:r>
+          </w:p>
+        </w:tc>
+      </w:tr>
+      <w:tr>
+        <w:tc>
+          <w:tcPr>
+            <w:tcW w:type="dxa" w:w="2880"/>
+          </w:tcPr>
+          <w:p>
+            <w:r>
+              <w:t>ENSG00000278928</w:t>
+            </w:r>
+          </w:p>
+        </w:tc>
+        <w:tc>
+          <w:tcPr>
+            <w:tcW w:type="dxa" w:w="2880"/>
+          </w:tcPr>
+          <w:p>
+            <w:r>
+              <w:t>-1.66</w:t>
+            </w:r>
+          </w:p>
+        </w:tc>
+        <w:tc>
+          <w:tcPr>
+            <w:tcW w:type="dxa" w:w="2880"/>
+          </w:tcPr>
+          <w:p>
+            <w:r>
+              <w:t>7.84e-41</w:t>
+            </w:r>
+          </w:p>
+        </w:tc>
+      </w:tr>
+      <w:tr>
+        <w:tc>
+          <w:tcPr>
+            <w:tcW w:type="dxa" w:w="2880"/>
+          </w:tcPr>
+          <w:p>
+            <w:r>
+              <w:t>ENSG00000165478</w:t>
+            </w:r>
+          </w:p>
+        </w:tc>
+        <w:tc>
+          <w:tcPr>
+            <w:tcW w:type="dxa" w:w="2880"/>
+          </w:tcPr>
+          <w:p>
+            <w:r>
+              <w:t>-1.67</w:t>
+            </w:r>
+          </w:p>
+        </w:tc>
+        <w:tc>
+          <w:tcPr>
+            <w:tcW w:type="dxa" w:w="2880"/>
+          </w:tcPr>
+          <w:p>
+            <w:r>
+              <w:t>1.17e-40</w:t>
+            </w:r>
+          </w:p>
+        </w:tc>
+      </w:tr>
+      <w:tr>
+        <w:tc>
+          <w:tcPr>
+            <w:tcW w:type="dxa" w:w="2880"/>
+          </w:tcPr>
+          <w:p>
+            <w:r>
+              <w:t>ENSG00000224958</w:t>
+            </w:r>
+          </w:p>
+        </w:tc>
+        <w:tc>
+          <w:tcPr>
+            <w:tcW w:type="dxa" w:w="2880"/>
+          </w:tcPr>
+          <w:p>
+            <w:r>
+              <w:t>-1.64</w:t>
+            </w:r>
+          </w:p>
+        </w:tc>
+        <w:tc>
+          <w:tcPr>
+            <w:tcW w:type="dxa" w:w="2880"/>
+          </w:tcPr>
+          <w:p>
+            <w:r>
+              <w:t>1.93e-40</w:t>
+            </w:r>
+          </w:p>
+        </w:tc>
+      </w:tr>
+      <w:tr>
+        <w:tc>
+          <w:tcPr>
+            <w:tcW w:type="dxa" w:w="2880"/>
+          </w:tcPr>
+          <w:p>
+            <w:r>
+              <w:t>ENSG00000187758</w:t>
+            </w:r>
+          </w:p>
+        </w:tc>
+        <w:tc>
+          <w:tcPr>
+            <w:tcW w:type="dxa" w:w="2880"/>
+          </w:tcPr>
+          <w:p>
+            <w:r>
+              <w:t>-1.68</w:t>
+            </w:r>
+          </w:p>
+        </w:tc>
+        <w:tc>
+          <w:tcPr>
+            <w:tcW w:type="dxa" w:w="2880"/>
+          </w:tcPr>
+          <w:p>
+            <w:r>
+              <w:t>2.06e-40</w:t>
+            </w:r>
+          </w:p>
+        </w:tc>
+      </w:tr>
+      <w:tr>
+        <w:tc>
+          <w:tcPr>
+            <w:tcW w:type="dxa" w:w="2880"/>
+          </w:tcPr>
+          <w:p>
+            <w:r>
+              <w:t>ENSG00000171819</w:t>
+            </w:r>
+          </w:p>
+        </w:tc>
+        <w:tc>
+          <w:tcPr>
+            <w:tcW w:type="dxa" w:w="2880"/>
+          </w:tcPr>
+          <w:p>
+            <w:r>
+              <w:t>-1.60</w:t>
+            </w:r>
+          </w:p>
+        </w:tc>
+        <w:tc>
+          <w:tcPr>
+            <w:tcW w:type="dxa" w:w="2880"/>
+          </w:tcPr>
+          <w:p>
+            <w:r>
+              <w:t>2.73e-40</w:t>
+            </w:r>
+          </w:p>
+        </w:tc>
+      </w:tr>
+      <w:tr>
+        <w:tc>
+          <w:tcPr>
+            <w:tcW w:type="dxa" w:w="2880"/>
+          </w:tcPr>
+          <w:p>
+            <w:r>
+              <w:t>ENSG00000250961</w:t>
+            </w:r>
+          </w:p>
+        </w:tc>
+        <w:tc>
+          <w:tcPr>
+            <w:tcW w:type="dxa" w:w="2880"/>
+          </w:tcPr>
+          <w:p>
+            <w:r>
+              <w:t>-1.55</w:t>
+            </w:r>
+          </w:p>
+        </w:tc>
+        <w:tc>
+          <w:tcPr>
+            <w:tcW w:type="dxa" w:w="2880"/>
+          </w:tcPr>
+          <w:p>
+            <w:r>
+              <w:t>7.68e-40</w:t>
+            </w:r>
+          </w:p>
+        </w:tc>
+      </w:tr>
+      <w:tr>
+        <w:tc>
+          <w:tcPr>
+            <w:tcW w:type="dxa" w:w="2880"/>
+          </w:tcPr>
+          <w:p>
+            <w:r>
+              <w:t>ENSG00000186466</w:t>
+            </w:r>
+          </w:p>
+        </w:tc>
+        <w:tc>
+          <w:tcPr>
+            <w:tcW w:type="dxa" w:w="2880"/>
+          </w:tcPr>
+          <w:p>
+            <w:r>
+              <w:t>-1.66</w:t>
+            </w:r>
+          </w:p>
+        </w:tc>
+        <w:tc>
+          <w:tcPr>
+            <w:tcW w:type="dxa" w:w="2880"/>
+          </w:tcPr>
+          <w:p>
+            <w:r>
+              <w:t>8.89e-40</w:t>
+            </w:r>
+          </w:p>
+        </w:tc>
+      </w:tr>
+      <w:tr>
+        <w:tc>
+          <w:tcPr>
+            <w:tcW w:type="dxa" w:w="2880"/>
+          </w:tcPr>
+          <w:p>
+            <w:r>
+              <w:t>ENSG00000224525</w:t>
+            </w:r>
+          </w:p>
+        </w:tc>
+        <w:tc>
+          <w:tcPr>
+            <w:tcW w:type="dxa" w:w="2880"/>
+          </w:tcPr>
+          <w:p>
+            <w:r>
+              <w:t>-1.79</w:t>
+            </w:r>
+          </w:p>
+        </w:tc>
+        <w:tc>
+          <w:tcPr>
+            <w:tcW w:type="dxa" w:w="2880"/>
+          </w:tcPr>
+          <w:p>
+            <w:r>
+              <w:t>8.89e-40</w:t>
+            </w:r>
+          </w:p>
+        </w:tc>
+      </w:tr>
+      <w:tr>
+        <w:tc>
+          <w:tcPr>
+            <w:tcW w:type="dxa" w:w="2880"/>
+          </w:tcPr>
+          <w:p>
+            <w:r>
+              <w:t>ENSG00000286322</w:t>
+            </w:r>
+          </w:p>
+        </w:tc>
+        <w:tc>
+          <w:tcPr>
+            <w:tcW w:type="dxa" w:w="2880"/>
+          </w:tcPr>
+          <w:p>
+            <w:r>
+              <w:t>-1.72</w:t>
+            </w:r>
+          </w:p>
+        </w:tc>
+        <w:tc>
+          <w:tcPr>
+            <w:tcW w:type="dxa" w:w="2880"/>
+          </w:tcPr>
+          <w:p>
+            <w:r>
+              <w:t>3.28e-39</w:t>
+            </w:r>
+          </w:p>
+        </w:tc>
+      </w:tr>
+      <w:tr>
+        <w:tc>
+          <w:tcPr>
+            <w:tcW w:type="dxa" w:w="2880"/>
+          </w:tcPr>
+          <w:p>
+            <w:r>
+              <w:t>ENSG00000246022</w:t>
+            </w:r>
+          </w:p>
+        </w:tc>
+        <w:tc>
+          <w:tcPr>
+            <w:tcW w:type="dxa" w:w="2880"/>
+          </w:tcPr>
+          <w:p>
+            <w:r>
+              <w:t>-1.74</w:t>
+            </w:r>
+          </w:p>
+        </w:tc>
+        <w:tc>
+          <w:tcPr>
+            <w:tcW w:type="dxa" w:w="2880"/>
+          </w:tcPr>
+          <w:p>
+            <w:r>
+              <w:t>5.76e-39</w:t>
+            </w:r>
+          </w:p>
+        </w:tc>
+      </w:tr>
+      <w:tr>
+        <w:tc>
+          <w:tcPr>
+            <w:tcW w:type="dxa" w:w="2880"/>
+          </w:tcPr>
+          <w:p>
+            <w:r>
+              <w:t>ENSG00000236333</w:t>
+            </w:r>
+          </w:p>
+        </w:tc>
+        <w:tc>
+          <w:tcPr>
+            <w:tcW w:type="dxa" w:w="2880"/>
+          </w:tcPr>
+          <w:p>
+            <w:r>
+              <w:t>-1.58</w:t>
+            </w:r>
+          </w:p>
+        </w:tc>
+        <w:tc>
+          <w:tcPr>
+            <w:tcW w:type="dxa" w:w="2880"/>
+          </w:tcPr>
+          <w:p>
+            <w:r>
+              <w:t>6.86e-39</w:t>
+            </w:r>
+          </w:p>
+        </w:tc>
+      </w:tr>
+      <w:tr>
+        <w:tc>
+          <w:tcPr>
+            <w:tcW w:type="dxa" w:w="2880"/>
+          </w:tcPr>
+          <w:p>
+            <w:r>
+              <w:t>ENSG00000277737</w:t>
+            </w:r>
+          </w:p>
+        </w:tc>
+        <w:tc>
+          <w:tcPr>
+            <w:tcW w:type="dxa" w:w="2880"/>
+          </w:tcPr>
+          <w:p>
+            <w:r>
+              <w:t>-1.94</w:t>
+            </w:r>
+          </w:p>
+        </w:tc>
+        <w:tc>
+          <w:tcPr>
+            <w:tcW w:type="dxa" w:w="2880"/>
+          </w:tcPr>
+          <w:p>
+            <w:r>
+              <w:t>7.04e-39</w:t>
+            </w:r>
+          </w:p>
+        </w:tc>
+      </w:tr>
+    </w:tbl>
     <w:p>
       <w:pPr>
         <w:pStyle w:val="Heading2"/>

</xml_diff>

<commit_message>
Author scrub (her 11:14:11 directive, wamid...ODZDNwA=): removed fleet bylines from all 4 tex papers + MEGA27-10 docx, kept her name in paper/main.tex (U. Phookan), rebuilt malaria 58pp/pneumonia 57pp/combined 31pp/MEGA27-10 53pp, PDF author metadata absent; pneumonia+combined use mathptmx fallback (TTFs absent, FONTS.md-sanctioned)
</commit_message>
<xml_diff>
--- a/paper/MEGA27-10-paper.docx
+++ b/paper/MEGA27-10-paper.docx
@@ -13,14 +13,6 @@
           <w:sz w:val="32"/>
         </w:rPr>
         <w:t>Cross-Disease Graph Diagnosis: A Clinical Benchmark of CNN and GNN Architectures and a Falsifiable Test of Cross-Disease Patient Bridges</w:t>
-      </w:r>
-    </w:p>
-    <w:p>
-      <w:pPr>
-        <w:jc w:val="center"/>
-      </w:pPr>
-      <w:r>
-        <w:t>MEGA-27 Item 10 - Deep-Learning Diagnosis Suite. September 24, 2026.</w:t>
       </w:r>
     </w:p>
     <w:p>

</xml_diff>

<commit_message>
Lane10: census and native-paper correction
</commit_message>
<xml_diff>
--- a/paper/MEGA27-10-paper.docx
+++ b/paper/MEGA27-10-paper.docx
@@ -13,6 +13,14 @@
           <w:sz w:val="32"/>
         </w:rPr>
         <w:t>Cross-Disease Graph Diagnosis: A Clinical Benchmark of CNN and GNN Architectures and a Falsifiable Test of Cross-Disease Patient Bridges</w:t>
+      </w:r>
+    </w:p>
+    <w:p>
+      <w:pPr>
+        <w:jc w:val="center"/>
+      </w:pPr>
+      <w:r>
+        <w:t>MEGA-27 Item 10 - Deep-Learning Diagnosis Suite. September 24, 2026.</w:t>
       </w:r>
     </w:p>
     <w:p>
@@ -201,7 +209,7 @@
         <w:br/>
         <w:t>bridge effect per disease is the paired per-seed AUC difference between the</w:t>
         <w:br/>
-        <w:t>full and ablated graphs (Eq. 9); significance uses the exact sign test</w:t>
+        <w:t>full and ablated graphs (Eq. 9); significance uses the conditional sign test</w:t>
         <w:br/>
         <w:t>(Proposition 1). Label-efficiency experiments subsample training labels at</w:t>
         <w:br/>
@@ -274,7 +282,7 @@
     </w:p>
     <w:p>
       <w:r>
-        <w:t>(9) Bridge ablation: Delta^{(d)} = (1/S) sum_s (AUC_full - AUC_no-bridge); sign-test p = 2^{-S} sum_{k&gt;=k0} C(S,k) under the no-signal null (Proposition 1).</w:t>
+        <w:t>(9) Bridge ablation: Delta^{(d)} = (1/S) sum_s (AUC_full - AUC_no-bridge); conditional one-sided sign-test p = 2^{-S} sum_{k&gt;=k0} C(S,k); independence and sign symmetry are unverified.</w:t>
       </w:r>
     </w:p>
     <w:p>
@@ -11843,23 +11851,7 @@
     </w:p>
     <w:p>
       <w:r>
-        <w:t>Derivation 4 (Exactness of the sign test for bridge ablation). Under the</w:t>
-        <w:br/>
-        <w:t>null that cross-disease edges carry no signal for disease d, the paired</w:t>
-        <w:br/>
-        <w:t>differences D_s = AUC_full,s - AUC_abl,s are symmetric about zero, so</w:t>
-        <w:br/>
-        <w:t>S+ = #{s : D_s &gt; 0} ~ Binomial(S, 1/2), because seeds enter only through</w:t>
-        <w:br/>
-        <w:t>independent split and initialization randomness and the two variants share</w:t>
-        <w:br/>
-        <w:t>all other randomness by construction (paired design). The exact two-sided</w:t>
-        <w:br/>
-        <w:t>p-value 2^{-S} sum_{k&gt;=k0} C(S,k) needs no normality assumption, which is</w:t>
-        <w:br/>
-        <w:t>what makes the bridge claim falsifiable at S = 5: five of five positive</w:t>
-        <w:br/>
-        <w:t>seeds give p = 0.031 &lt; 0.05, four of five give p = 0.188.</w:t>
+        <w:t>Derivation 4 (Sign-test assumptions). A binomial sign test needs independent nonzero paired differences and null sign probability one-half. Sharing cohorts, overlapping splits and graph construction across seeds does not establish those assumptions. The former exact significance claim is withdrawn. Under hypothetical valid assumptions, five positive differences give one-sided p=0.03125 and two-sided p=0.0625; the earlier formula mislabeled one-sided as two-sided. Recorded bridge deltas remain descriptive, not established transferable biology.</w:t>
       </w:r>
     </w:p>
     <w:p>
@@ -11981,7 +11973,7 @@
         <w:br/>
         <w:t>it should. On the full five-seed paired ablation, removing cross-disease</w:t>
         <w:br/>
-        <w:t>edges costs Pima 0.0066 AUC with all five seeds positive (exact sign-test</w:t>
+        <w:t>edges costs Pima 0.0066 AUC with all five seeds positive (unverified sign-test</w:t>
         <w:br/>
         <w:t>p = 0.031), Parkinson's 0.0140 AUC (three of five seeds positive, largest</w:t>
         <w:br/>
@@ -24898,6 +24890,22 @@
         <w:t>panel auc by arm</w:t>
       </w:r>
     </w:p>
+    <w:p>
+      <w:pPr>
+        <w:pStyle w:val="Heading1"/>
+      </w:pPr>
+      <w:r>
+        <w:rPr>
+          <w:rFonts w:ascii="Times New Roman" w:hAnsi="Times New Roman"/>
+        </w:rPr>
+        <w:t>October 1 evidence correction and completion boundary</w:t>
+      </w:r>
+    </w:p>
+    <w:p>
+      <w:r>
+        <w:t>Locked Model C accuracy mean0.8958333333,95% t interval[0.8183317307,0.9733349360], fails0.90 hypothesis and0.928 comparator gates. Seed37 AUC0.9628205128 and Brier0.0679723889 do not substitute for accuracy. Post-hoc seed37 ECE0.0468606536 is descriptive only; seeds11/23 ECE unavailable. Malaria R-M2 from-scratch ResNet18 mean0.9471001905, interval[0.9311493743,0.9630510067], fails&gt;0.957. No locked thresholds were changed. All prior bridge significance language is exploratory: independent fair signs were not established, and five of five positive is two-sided0.0625, not0.031. The50-page length does not certify dataset/tool census, novelty, or a benchmark win. Main.tex is a separate short draft, not the sole paper artifact.</w:t>
+      </w:r>
+    </w:p>
     <w:sectPr>
       <w:pgSz w:w="12240" w:h="15840"/>
       <w:pgMar w:top="1440" w:right="1800" w:bottom="1440" w:left="1800" w:header="720" w:footer="720" w:gutter="0"/>

</xml_diff>

<commit_message>
Lane10: restrict fingerprint invariance to common rescaling
</commit_message>
<xml_diff>
--- a/paper/MEGA27-10-paper.docx
+++ b/paper/MEGA27-10-paper.docx
@@ -11909,19 +11909,7 @@
     </w:p>
     <w:p>
       <w:r>
-        <w:t>Derivation 8 (Fingerprint comparability). For any invertible affine</w:t>
-        <w:br/>
-        <w:t>reparametrization of a dataset's feature space x -&gt; Mx + b with diagonal</w:t>
-        <w:br/>
-        <w:t>M, the per-patient standardized moments m_r = mean_j ((x_j - mu)/sigma)^r</w:t>
-        <w:br/>
-        <w:t>are invariant, because mu and sigma transform covariantly. The fingerprint</w:t>
-        <w:br/>
-        <w:t>(Eq. 4) is therefore a property of the patient's distributional shape, not</w:t>
-        <w:br/>
-        <w:t>of the feature units, which is precisely what makes cross-disease edges</w:t>
-        <w:br/>
-        <w:t>well-defined.</w:t>
+        <w:t>Derivation 8 (Fingerprint comparability boundary). Standardized moments of a patient's feature vector are invariant to a common positive scalar rescaling and common shift of all coordinates. They are not generally invariant to independently scaling or shifting each feature. For example, coordinatewise scaling changes relative feature magnitudes and therefore the within-vector mean and spread. Feature order may be discarded, but this does not make mixed units, feature sets or disease cohorts commensurate. Cross-disease fingerprint geometry is an empirical design choice, not a proof of shared biological meaning.</w:t>
       </w:r>
     </w:p>
     <w:p>

</xml_diff>

<commit_message>
Lane10: reconcile main methods with census and fingerprint audit
</commit_message>
<xml_diff>
--- a/paper/MEGA27-10-paper.docx
+++ b/paper/MEGA27-10-paper.docx
@@ -24,6 +24,16 @@
       </w:r>
     </w:p>
     <w:p>
+      <w:r>
+        <w:t>Udita Phookan</w:t>
+      </w:r>
+    </w:p>
+    <w:p>
+      <w:r>
+        <w:t>Working revision, October 7, 2026. Locked predictive gates failed. Dataset independence, scientific-tool breadth, novelty and matched benchmark superiority remain open. The PDF uses Liberation Serif because actual Times New Roman is unavailable. Page length includes tables and appendices, not an equivalent amount of new research.</w:t>
+      </w:r>
+    </w:p>
+    <w:p>
       <w:pPr>
         <w:pStyle w:val="Heading1"/>
       </w:pPr>
@@ -36,7 +46,7 @@
     </w:p>
     <w:p>
       <w:r>
-        <w:t>We benchmark MLP, 1D-CNN, GCN and GAT diagnosis models against strong classical baselines on real clinical datasets (accession-level, URLs verified), with bootstrap confidence intervals and calibration metrics, and we test a falsifiable discovery claim: cross-disease patient bridges - edges of a unified patient-similarity graph spanning diseases, built on disease-agnostic distributional fingerprints - carry transferable diagnostic signal. All claims are reported with seed variance; negative results are preserved.</w:t>
+        <w:t>We benchmark MLP, 1D-CNN, GCN and GAT diagnosis models against strong classical baselines on real clinical datasets (recorded sources, independent census unverified), with bootstrap confidence intervals and calibration metrics, and we test a falsifiable discovery claim: cross-disease patient bridges - edges of a unified patient-similarity graph spanning diseases, built on disease-agnostic distributional fingerprints - carry transferable diagnostic signal. All claims are reported with seed variance; negative results are preserved.</w:t>
       </w:r>
     </w:p>
     <w:p>
@@ -60,15 +70,15 @@
         <w:br/>
         <w:t>Cleveland heart disease, Pima diabetes and Parkinson's vocal-measurement</w:t>
         <w:br/>
-        <w:t>cohorts have each accumulated hundreds of classification papers, with</w:t>
+        <w:t>cohorts are widely reused benchmarks. This paper does not establish a</w:t>
         <w:br/>
-        <w:t>reported accuracies climbing from the mid-80s to above 99 percent over three</w:t>
+        <w:t>systematic prevalence estimate for leakage or headline-score inflation in</w:t>
         <w:br/>
-        <w:t>decades. A substantial fraction of those numbers were produced with</w:t>
+        <w:t>the literature. Non-nested selection and test-set peeking are risks to</w:t>
         <w:br/>
-        <w:t>non-nested feature selection, single random splits, or test-set peeking,</w:t>
+        <w:t>check in a matched comparator, rather than accusations inferred from a</w:t>
         <w:br/>
-        <w:t>which inflates estimates in ways that are invisible in the headline metric.</w:t>
+        <w:t>high reported score.</w:t>
         <w:br/>
         <w:t>This project asks three questions under a deliberately strict protocol</w:t>
         <w:br/>
@@ -130,13 +140,15 @@
     </w:p>
     <w:p>
       <w:r>
-        <w:t>Datasets. Twenty-six accession-level clinical datasets are used, all</w:t>
+        <w:t>Datasets. Twenty-six named core/panel result entries are recorded (four core and</w:t>
         <w:br/>
-        <w:t>downloaded from the UCI Machine Learning Repository or a cited public</w:t>
+        <w:t>twenty-two panel files). Their source routes are UCI or cited public</w:t>
         <w:br/>
-        <w:t>mirror; every URL was verified live (HTTP 200) on the day of the</w:t>
+        <w:t>mirrors. These files are not an independently deduplicated dataset census.</w:t>
         <w:br/>
-        <w:t>experiments. The four core cohorts (WDBC, Cleveland heart disease, Pima</w:t>
+        <w:t>HTTP success alone does not verify source identity, labels, independence</w:t>
+        <w:br/>
+        <w:t>or current availability; the historical URL-check claim is not certified. The four core cohorts (WDBC, Cleveland heart disease, Pima</w:t>
         <w:br/>
         <w:t>diabetes, Parkinson's) receive the full six-model, five-seed treatment; a</w:t>
         <w:br/>
@@ -188,9 +200,13 @@
         <w:br/>
         <w:t>(Eq. 4) - moments and quantiles of the patient's own feature vector - which</w:t>
         <w:br/>
-        <w:t>is comparable across diseases by construction because it does not reference</w:t>
+        <w:t>discards feature identity but is not thereby comparable across diseases.</w:t>
         <w:br/>
-        <w:t>any specific native feature. The unified graph is the union of the latent</w:t>
+        <w:t>Raw moments and quantiles still depend on units, feature sets and cohort</w:t>
+        <w:br/>
+        <w:t>composition. Only the standardized moments have the restricted common</w:t>
+        <w:br/>
+        <w:t>rescaling invariance stated in Derivation 8. The unified graph is the union of the latent</w:t>
         <w:br/>
         <w:t>kNN graph and the fingerprint kNN graph; a two-layer GCN trunk with one</w:t>
         <w:br/>
@@ -209,9 +225,11 @@
         <w:br/>
         <w:t>bridge effect per disease is the paired per-seed AUC difference between the</w:t>
         <w:br/>
-        <w:t>full and ablated graphs (Eq. 9); significance uses the conditional sign test</w:t>
+        <w:t>full and ablated graphs (Eq. 9); a hypothetical conditional sign-test formula is supplied</w:t>
         <w:br/>
-        <w:t>(Proposition 1). Label-efficiency experiments subsample training labels at</w:t>
+        <w:t>(Proposition 1), but its independence and fair-sign assumptions are not</w:t>
+        <w:br/>
+        <w:t>established for seeds sharing patients. Bridge differences are descriptive. Label-efficiency experiments subsample training labels at</w:t>
         <w:br/>
         <w:t>10, 25, 50 and 100 percent, five seeds, comparing transductive GCN against</w:t>
         <w:br/>
@@ -257,7 +275,7 @@
     </w:p>
     <w:p>
       <w:r>
-        <w:t>(4) Distributional fingerprint phi(x) = (mu, sigma, min, max, q25, q50, q75, m3, m4, |z|_1/d), m_r = mean z_j^r, z_j = (x_j - mu)/sigma - disease-agnostic by construction.</w:t>
+        <w:t>(4) Distributional fingerprint phi(x) = (mu, sigma, min, max, q25, q50, q75, m3, m4, |z|_1/d), m_r = mean z_j^r, z_j = (x_j - mu)/sigma - feature identities discarded; cross-disease comparability unproven.</w:t>
       </w:r>
     </w:p>
     <w:p>

</xml_diff>

<commit_message>
Lane10: reword XGBoost baseline claim, rebuild 53pp
</commit_message>
<xml_diff>
--- a/paper/MEGA27-10-paper.docx
+++ b/paper/MEGA27-10-paper.docx
@@ -19756,9 +19756,11 @@
         <w:br/>
         <w:t>committed model on 5 of 22 datasets, and the per-dataset comparison is</w:t>
         <w:br/>
-        <w:t>reported in full - the deep models' wins are not artifacts of a weak</w:t>
+        <w:t>reported in full. Boosting wins on 5 of 22; this comparison does not by</w:t>
         <w:br/>
-        <w:t>classical baseline, and where boosting wins, that is said. (ii) The</w:t>
+        <w:t>itself show the deep models' wins on the other 17 are free of baseline</w:t>
+        <w:br/>
+        <w:t>weakness, and where boosting wins, that is said. (ii) The</w:t>
         <w:br/>
         <w:t>cross-disease bridge discovery was subjected to a Benjamini-Hochberg FDR</w:t>
         <w:br/>

</xml_diff>

<commit_message>
Lane10: pass-3 claim rewording and CNN claim recheck, rebuild 53pp
</commit_message>
<xml_diff>
--- a/paper/MEGA27-10-paper.docx
+++ b/paper/MEGA27-10-paper.docx
@@ -13200,9 +13200,9 @@
         <w:br/>
         <w:t>tuberculosis - cross-validated AUCs range from 0.84 to 1.000. The near-</w:t>
         <w:br/>
-        <w:t>perfect scores on several oncology cohorts are expected rather than</w:t>
+        <w:t>perfect scores on several oncology cohorts are consistent with</w:t>
         <w:br/>
-        <w:t>suspicious: bulk tumor-versus-adjacent-normal expression separation is one</w:t>
+        <w:t>prior reports, not verified here as leak-free: bulk tumor-versus-adjacent-normal expression separation is one</w:t>
         <w:br/>
         <w:t>of the strongest signals in transcriptomics, and the small control arms of</w:t>
         <w:br/>
@@ -19802,9 +19802,9 @@
         <w:br/>
         <w:t>Mann-Whitney differential-expression screen (BH-FDR) over TCGA-BRCA</w:t>
         <w:br/>
-        <w:t>confirms the biological basis of the tumor/normal signal the classifier</w:t>
+        <w:t>is consistent with a tumor/normal expression signal of the kind the classifier</w:t>
         <w:br/>
-        <w:t>exploits. (x) A 15-trial TPE</w:t>
+        <w:t>may exploit; it does not confirm the mechanism. (x) A 15-trial TPE</w:t>
         <w:br/>
         <w:t>hyperparameter search (optuna) bounds how much the wdbc MLP could gain</w:t>
         <w:br/>
@@ -23505,11 +23505,9 @@
     </w:p>
     <w:p>
       <w:r>
-        <w:t>2. The 1D-CNN over the feature axis never wins a core dataset; feature</w:t>
+        <w:t>2. The 1D-CNN over the feature axis did not have the top mean ROC AUC on any of the four core datasets (cleveland, parkinsons, pima, wdbc); feature</w:t>
         <w:br/>
-        <w:t>order carries no spatial structure for it to exploit, and it is strictly</w:t>
-        <w:br/>
-        <w:t>dominated by the MLP it generalizes.</w:t>
+        <w:t>order carries no spatial structure for it to exploit, and it did not beat the MLP in the recorded runs.</w:t>
       </w:r>
     </w:p>
     <w:p>

</xml_diff>